<commit_message>
Disease-level confidence intervals and reply to the external review of the preprint (P34)
- benchmark/cluster_ci.py + CLUSTER_CI.md: Recall@100 intervals from a bootstrap that resamples
  whole diseases, paired differences per disease (Wilcoxon, Holm over 28 comparisons) and the
  effect of random tie-breaking; reproduces the published means exactly from the release files
- docs/preprint/: CIs (new Table S4), primary vs exploratory analyses, external result before the
  external set was consulted (0.352), narrower wording on new uses and on the methods compared,
  Open Targets feature/label overlap stated as a limitation
- docs/REVIEW_RESPONSE.md: point-by-point answer and the five tasks left for the home PC (T1-T5)
  with steps, commands and decision rules fixed in advance; STATUS and DECISIONS point to it

Co-Authored-By: Claude Opus 5.5 <noreply@anthropic.com>
</commit_message>
<xml_diff>
--- a/docs/preprint/OREVID_preprint_draft.docx
+++ b/docs/preprint/OREVID_preprint_draft.docx
@@ -63,7 +63,7 @@
         <w:t xml:space="preserve">Results.</w:t>
       </w:r>
       <w:r>
-        <w:t xml:space="preserve"> Zero-shot Recall@100 (mean ± SD over five splits) was 0.811 ± 0.042 for OREVID, 0.412 ± 0.042 for TxGNN and 0.358 ± 0.040 for a popularity baseline, with OREVID ahead on every split. On nine disease areas held out it was 0.617 against 0.237, ahead in all nine, although TxGNN had the higher AUPRC in five. Training OREVID without validation labels and excluding diseases where TxGNN outputs constant scores gave 0.809 against 0.421. On 3,718 approvals absent from PrimeKG, Recall@100 was 0.359 against 0.121, and 0.178 against 0.085 for the 2,719 approvals not obvious from the disease ontology; a logistic regression on the same features without the drug-popularity feature performed similarly. Of the candidates the website's rules select in this external exam, 12.6% (95% CI 11.5–13.8%) of direct extensions and 4.2% (3.6–4.9%) of shared-genes candidates were among the unseen approvals, against about 0.07% by chance. A drug acting on a disease gene, with no other evidence, was right 1.8–3.4% of the time, no better than candidates with no evidence line at all.</w:t>
+        <w:t xml:space="preserve"> Zero-shot Recall@100 (mean ± SD over five splits) was 0.811 ± 0.042 for OREVID, 0.412 ± 0.042 for TxGNN and 0.358 ± 0.040 for a popularity baseline, with OREVID ahead on every split (paired difference with TxGNN 0.399, 95% CI 0.352–0.443, resampling diseases). On nine disease areas held out it was 0.617 against 0.237, ahead in all nine, although TxGNN had the higher AUPRC in five. Training OREVID without validation labels and excluding diseases where TxGNN outputs constant scores gave 0.809 against 0.421. On 3,718 approvals absent from PrimeKG, Recall@100 was 0.359 against 0.121, and 0.178 against 0.085 for the 2,719 approvals not obvious from the disease ontology; a logistic regression on the same features without the drug-popularity feature performed similarly. Of the candidates the website's rules select in this external exam, 12.6% (95% CI 11.5–13.8%) of direct extensions and 4.2% (3.6–4.9%) of shared-genes candidates were among the unseen approvals, against about 0.07% by chance. A drug acting on a disease gene, with no other evidence, was right 1.8–3.4% of the time, no better than candidates with no evidence line at all.</w:t>
       </w:r>
     </w:p>
     <w:p>
@@ -75,7 +75,7 @@
         <w:t xml:space="preserve">Conclusions.</w:t>
       </w:r>
       <w:r>
-        <w:t xml:space="preserve"> Reporting the hit rate of each evidence line makes repurposing predictions checkable and shows how low their precision for new uses is. Most of the signal comes from what already works in related diseases. OREVID is a hypothesis generator, not a clinical tool; code, data and benchmark are public (https://orevid.org, doi:10.5281/zenodo.23323226).</w:t>
+        <w:t xml:space="preserve"> Reporting the hit rate of each evidence line makes repurposing predictions checkable and shows how low their precision is on approved uses missing from the training graph. Most of the signal comes from what already works in related diseases. OREVID is a hypothesis generator, not a clinical tool; code, data and benchmark are public (https://orevid.org, doi:10.5281/zenodo.23323226).</w:t>
       </w:r>
     </w:p>
     <w:p>
@@ -244,7 +244,7 @@
     <w:p>
       <w:pPr/>
       <w:r>
-        <w:t xml:space="preserve">Of the 25 highest-ranked candidates that are not already approved for the disease, a candidate is shown only if it is indicated for an ontology-neighbour disease («direct extension») or for a disease sharing at least 3 associated genes with a hypergeometric p &lt; 10⁻⁶ («shared genes»). Every other candidate is hidden. The acceptance criteria were fixed in advance: an evidence line had to separate correct from incorrect candidates on both the zero-shot benchmark (seeds 1–5) and the nine held-out disease areas, and a filter was applied only if the subset it removed had a hit rate below 5% in both. The rules themselves were revised in three rounds, each evaluated on both datasets, so the areas are not an untouched confirmation set. The external exam was used only as a confirmation set, together with the other splits, for two design decisions (the weight of the specificity correction and the removal of one data source, CTD), and never to choose an evidence rule. A proposed grading of the shown candidates into three levels did not replicate (the first two levels swapped order on the hard area subset, and the third did not reach the threshold) and was dropped. Two filters suggested by an AI agent acting as reviewer (see Use of AI), requiring the drug's target to touch the shared genes and excluding anti-infectives in non-infectious diseases, failed the criterion and were not applied. Whether at least 3 of the shared genes are specific (associated with fewer than 100 diseases) is displayed but not used as a filter.</w:t>
+        <w:t xml:space="preserve">Of the 25 highest-ranked candidates that are not already approved for the disease, a candidate is shown only if it is indicated for an ontology-neighbour disease («direct extension») or for a disease sharing at least 3 associated genes with a hypergeometric p &lt; 10⁻⁶ («shared genes»). Every other candidate is hidden. The acceptance criteria were fixed in advance: an evidence line had to separate correct from incorrect candidates on both the zero-shot benchmark (seeds 1–5) and the nine held-out disease areas, and a filter was applied only if the subset it removed had a hit rate below 5% in both. The rules themselves were revised in three rounds, each evaluated on both datasets, so the areas are not an untouched confirmation set. The external exam was used only as a confirmation set, together with the other splits, for two design decisions (the weight of the specificity correction and the removal of one data source, CTD), and never to choose an evidence rule. Neither decision moved the external result much: with CTD kept, as before the external set was consulted, OREVID's Recall@100 there was 0.352 instead of 0.359 (TxGNN 0.121), and the specificity correction is not applied to the benchmark rankings. A proposed grading of the shown candidates into three levels did not replicate (the first two levels swapped order on the hard area subset, and the third did not reach the threshold) and was dropped. Two filters suggested by an AI agent acting as reviewer (see Use of AI), requiring the drug's target to touch the shared genes and excluding anti-infectives in non-infectious diseases, failed the criterion and were not applied. Whether at least 3 of the shared genes are specific (associated with fewer than 100 diseases) is displayed but not used as a filter.</w:t>
       </w:r>
     </w:p>
     <w:p>
@@ -276,7 +276,7 @@
     <w:p>
       <w:pPr/>
       <w:r>
-        <w:t xml:space="preserve">OREVID-bench reproduces TxGNN's zero-shot («complex disease») split exactly for five seeds (64–71 test diseases each, 335 in total), whose test diseases lose all their drug–disease edges, and nine disease-area splits built from TxGNN's area lists with a fixed seed (345 test diseases). Metrics follow TxGNN's evaluation notebook. AUPRC uses, for each disease, as many negatives as positives, sampled with replacement (seed 42) among drugs with at least one training indication. Recall@100 and Precision@K (K = the number of correct drugs) are computed over all 7,957 drugs, with ties broken at random. A «hard» subset excludes test diseases whose ontology neighbours within two steps already carry at least half of their drugs; this 50% threshold was set by hand. Novelty scenarios restrict candidates to approved drugs, remove the 10% of drugs with most indications, or keep only correct drugs with no other indication. Single-metapath baselines rank drugs by one metapath alone.</w:t>
+        <w:t xml:space="preserve">OREVID-bench reproduces TxGNN's zero-shot («complex disease») split exactly for five seeds (64–71 test diseases each, 335 in total), whose test diseases lose all their drug–disease edges, and nine disease-area splits built from TxGNN's area lists with a fixed seed (345 test diseases). Metrics follow TxGNN's evaluation notebook. AUPRC uses, for each disease, as many negatives as positives, sampled with replacement (seed 42) among drugs with at least one training indication. Recall@100 and Precision@K (K = the number of correct drugs) are computed over all 7,957 drugs, with ties broken at random; with 20 other tie-breaking seeds every reported mean moved by at most 0.014, and OREVID's not at all. A «hard» subset excludes test diseases whose ontology neighbours within two steps already carry at least half of their drugs; this 50% threshold was set by hand. Novelty scenarios restrict candidates to approved drugs, remove the 10% of drugs with most indications, or keep only correct drugs with no other indication. Single-metapath baselines rank drugs by one metapath alone.</w:t>
       </w:r>
     </w:p>
     <w:p>
@@ -302,7 +302,7 @@
     <w:p>
       <w:pPr/>
       <w:r>
-        <w:t xml:space="preserve">Zero-shot results are given as mean ± standard deviation over the five seeds, with the paired difference between models per seed. Disease-area results are means over the nine areas; because areas range from 2 to 180 test diseases, means weighted by disease are also given. Hit rates have Wilson 95% confidence intervals, which treat candidates as independent and are therefore too narrow when several candidates of the same disease are right or wrong together. No correction for multiple comparisons was applied. The external exam uses a single training split, so its variability between seeds is not estimated.</w:t>
+        <w:t xml:space="preserve">Zero-shot results are given as mean ± standard deviation over the five seeds, with the paired difference between models per seed. Disease-area results are means over the nine areas; because areas range from 2 to 180 test diseases, means weighted by disease are also given. Confidence intervals for Recall@100 and for differences between models come from a bootstrap that resamples whole diseases (10,000 resamples, within seeds for zero-shot and within areas for the disease areas), so the correct drugs of one disease are never counted as independent. Differences are paired by disease and were also tested with a Wilcoxon signed-rank test on the per-disease differences, Holm-adjusted over 28 comparisons (Supplementary Table S4). Hit rates have Wilson 95% confidence intervals, which treat candidates as independent and are therefore too narrow when several candidates of the same disease are right or wrong together. The comparisons of OREVID with TxGNN and with the popularity baseline on Recall@100 are the primary analysis; subsets, novelty scenarios, single metapaths and hit rates by evidence line are exploratory and were not corrected for multiple comparisons. The external exam uses a single training split, so its variability between seeds is not estimated.</w:t>
       </w:r>
     </w:p>
     <w:p>
@@ -330,7 +330,7 @@
     <w:p>
       <w:pPr/>
       <w:r>
-        <w:t xml:space="preserve">OREVID recovered two to three times as many held-out treatments as TxGNN in every test (Figure 2, Table 1). On the zero-shot split, Recall@100 was 0.811 ± 0.042 against 0.412 ± 0.042, and OREVID was ahead on each of the five seeds (paired differences 0.36–0.47; on the hard subset 0.539 ± 0.090 against 0.258 ± 0.067, differences 0.21–0.43). On the disease areas it was ahead in all nine (Figure 3, Table 2): 0.617 against 0.237 as a mean of areas, and 0.637 against 0.269 weighted by disease; on the hard area diseases TxGNN (0.141) did no better than the popularity baseline (0.141). Precision@K showed the same pattern (zero-shot 0.573 against 0.079; areas 0.408 against 0.057). AUPRC under TxGNN's protocol, which sets each correct drug against one sampled negative, was closer: 0.952 ± 0.009 against 0.910 ± 0.036 on zero-shot and 0.897 against 0.866 on the areas, and TxGNN had the higher AUPRC in five of the nine areas. TxGNN separates correct drugs from random ones almost as well; OREVID's advantage is in ranking them high among all 7,957 drugs. The popularity baseline, which ignores the disease, reached 0.358 ± 0.040 on zero-shot, slightly below TxGNN, and 0.130 on the external exam, slightly above it (0.121).</w:t>
+        <w:t xml:space="preserve">OREVID recovered two to three times as many held-out treatments as TxGNN in every test (Figure 2, Table 1). Resampling whole diseases, the 95% interval of the paired difference in Recall@100 was +0.35 to +0.44 on zero-shot, +0.31 to +0.45 on the areas and +0.21 to +0.27 on the external exam; OREVID was ahead on 63% of zero-shot diseases and behind on 2%, the rest being ties (Supplementary Table S4). On the zero-shot split, Recall@100 was 0.811 ± 0.042 against 0.412 ± 0.042, and OREVID was ahead on each of the five seeds (paired differences 0.36–0.47; on the hard subset 0.539 ± 0.090 against 0.258 ± 0.067, differences 0.21–0.43). On the disease areas it was ahead in all nine (Figure 3, Table 2): 0.617 against 0.237 as a mean of areas, and 0.637 against 0.269 weighted by disease; on the hard area diseases TxGNN (0.141) did no better than the popularity baseline (0.141). Precision@K showed the same pattern (zero-shot 0.573 against 0.079; areas 0.408 against 0.057). AUPRC under TxGNN's protocol, which sets each correct drug against one sampled negative, was closer: 0.952 ± 0.009 against 0.910 ± 0.036 on zero-shot and 0.897 against 0.866 on the areas, and TxGNN had the higher AUPRC in five of the nine areas. TxGNN separates correct drugs from random ones almost as well; OREVID's advantage is in ranking them high among all 7,957 drugs. The popularity baseline, which ignores the disease, reached 0.358 ± 0.040 on zero-shot, slightly below TxGNN, and 0.130 on the external exam, slightly above it (0.121). Per disease, the difference between TxGNN and this baseline was not significant after Holm adjustment in any test except all area diseases (p = 0.047).</w:t>
       </w:r>
     </w:p>
     <w:p>
@@ -2240,19 +2240,19 @@
     <w:p>
       <w:pPr/>
       <w:r>
-        <w:t xml:space="preserve">On identical data and splits, an interpretable metapath model with ranking-aware training recovered two to three times as many held-out treatments as TxGNN, and the gap persisted on whole disease areas, on approvals absent from the training graph and after removing the protocol differences between the two systems. It did not depend on drug popularity: a logistic regression without that feature did as well on the external exam. On AUPRC with sampled negatives the two systems were close, and TxGNN was better in five of nine areas, so the difference lies mainly in how high correct drugs rank against the whole drug list. Most of the signal comes from what already works in related diseases, and the strongest line, indication in an ontology neighbour, is largely rediscovery, as its fall on the hard subsets shows. Mechanistic evidence alone (the drug acts on a disease gene) carried no measurable signal at the top of the ranking, which argues for presenting such links as context rather than as support.</w:t>
-      </w:r>
-    </w:p>
-    <w:p>
-      <w:pPr/>
-      <w:r>
-        <w:t xml:space="preserve">The practical value of a repurposing tool depends on precision for new indications, and here the numbers are modest. In the external exam about one in eight direct extensions and one in 25 shared-genes candidates was an approved indication; this is a lower bound, since many valid uses are never approved, but it means most candidates will not work. Publishing these rates next to the optimistic hidden-treatment figures, and hiding candidates whose evidence does not beat chance, is meant to let users calibrate their trust.</w:t>
-      </w:r>
-    </w:p>
-    <w:p>
-      <w:pPr/>
-      <w:r>
-        <w:t xml:space="preserve">No knowledge-graph embedding baseline (TransE, ComplEx or RotatE [5–7]) was run. Training and tuning such models on each of the 14 splits was beyond the compute available to this project, in which TxGNN alone took about 22 GPU hours. OREVID-bench provides the splits, tasks and evaluation script so that such models can be added, and submissions are welcome.</w:t>
+        <w:t xml:space="preserve">On identical data and splits, and on the ranking metrics used here, an interpretable metapath model with ranking-aware training recovered two to three times as many held-out treatments as TxGNN, and the gap persisted on whole disease areas, on approvals absent from the training graph and after removing the protocol differences between the two systems. It did not depend on drug popularity: a logistic regression without that feature did as well on the external exam. On AUPRC with sampled negatives the two systems were close, and TxGNN was better in five of nine areas, so the difference lies mainly in how high correct drugs rank against the whole drug list. Most of the signal comes from what already works in related diseases, and the strongest line, indication in an ontology neighbour, is largely rediscovery, as its fall on the hard subsets shows. Mechanistic evidence alone (the drug acts on a disease gene) carried no measurable signal at the top of the ranking, which argues for presenting such links as context rather than as support.</w:t>
+      </w:r>
+    </w:p>
+    <w:p>
+      <w:pPr/>
+      <w:r>
+        <w:t xml:space="preserve">The practical value of a repurposing tool depends on precision for new indications, and here the numbers are modest. In the external exam about one in eight direct extensions and one in 25 shared-genes candidates was an approved indication; this is a lower bound, since many valid uses are never approved, but it means most candidates will not work. These approvals are missing from PrimeKG but mostly old (median first trial 2008) and may be recorded in other databases, so the exam measures the recovery of known indications absent from the training graph, not discovery; only the 158 recent approvals and the prospective test below come closer to new uses. Publishing these rates next to the optimistic hidden-treatment figures, and hiding candidates whose evidence does not beat chance, is meant to let users calibrate their trust.</w:t>
+      </w:r>
+    </w:p>
+    <w:p>
+      <w:pPr/>
+      <w:r>
+        <w:t xml:space="preserve">No knowledge-graph embedding baseline (TransE, ComplEx or RotatE [5–7]) was run. Training and tuning such models on each of the 14 splits was beyond the compute available to this project, in which TxGNN alone took about 22 GPU hours. OREVID-bench provides the splits, tasks and evaluation script so that such models can be added, and submissions are welcome. Until then, the comparison covers one graph neural network and simple baselines, not every family of methods.</w:t>
       </w:r>
     </w:p>
     <w:p>
@@ -2264,7 +2264,7 @@
         <w:t xml:space="preserve">Limitations.</w:t>
       </w:r>
       <w:r>
-        <w:t xml:space="preserve"> All tests use recorded approvals as truth, which favours known treatments and penalises valid uses that were never approved. The external exam is out of sample but not prospective: most of those approvals predate PrimeKG and are simply missing from it; it also uses one training split, so its variability between seeds is unknown. The disease areas were used while designing both the model and the evidence rules, so they are not an untouched test set, and the threshold that defines the hard subset (half of the drugs already in a neighbour) was set by hand. Confidence intervals for hit rates ignore the clustering of candidates within diseases. Errors in the sources propagate, including wrong gene–disease associations and comorbidities that read as shared biology. The risk warning relies on recorded contraindications, gives no signal when the drug has no label in related diseases, and cannot detect opposite mechanisms or class toxicities; the direction of effect of a new drug is not predicted. Drugs with no prior indication remain beyond the reach of every model tested. Disease-area splits use one seed and approximate TxGNN's, which were drawn without a fixed seed. The reviews that led to some of the website's rules were done by AI agents, not by human experts (see Use of AI).</w:t>
+        <w:t xml:space="preserve"> All tests use recorded approvals as truth, which favours known treatments and penalises valid uses that were never approved. The external exam is out of sample but not prospective: most of those approvals predate PrimeKG and are simply missing from it; it also uses one training split, so its variability between seeds is unknown. The disease areas were used while designing both the model and the evidence rules, so they are not an untouched test set, and the threshold that defines the hard subset (half of the drugs already in a neighbour) was set by hand. Confidence intervals for hit rates ignore the clustering of candidates within diseases (those for Recall@100 resample whole diseases). Open Targets supplies gene–disease features as well as the external labels; its drug and literature evidence is excluded from the features, but a run without any Open Targets feature has not yet been done. Errors in the sources propagate, including wrong gene–disease associations and comorbidities that read as shared biology. The risk warning relies on recorded contraindications, gives no signal when the drug has no label in related diseases, and cannot detect opposite mechanisms or class toxicities; the direction of effect of a new drug is not predicted. Drugs with no prior indication remain beyond the reach of every model tested. Disease-area splits use one seed and approximate TxGNN's, which were drawn without a fixed seed. The reviews that led to some of the website's rules were done by AI agents, not by human experts (see Use of AI).</w:t>
       </w:r>
     </w:p>
     <w:p>
@@ -4573,6 +4573,695 @@
             <w:pPr/>
             <w:r>
               <w:t xml:space="preserve">1.4 (1.2–1.7; 8,981)</w:t>
+            </w:r>
+          </w:p>
+        </w:tc>
+      </w:tr>
+    </w:tbl>
+    <w:p>
+      <w:pPr/>
+      <w:r>
+        <w:rPr>
+          <w:b/>
+        </w:rPr>
+        <w:t xml:space="preserve">Supplementary Table S4.</w:t>
+      </w:r>
+      <w:r>
+        <w:t xml:space="preserve"> Recall@100 with 95% intervals from a bootstrap that resamples whole diseases (10,000 resamples; within seeds for zero-shot, within areas for the disease areas), and the paired difference between OREVID and TxGNN: interval, share of diseases where OREVID is ahead or behind (the rest are ties) and Wilcoxon signed-rank p, Holm-adjusted over 28 comparisons. Generated by </w:t>
+      </w:r>
+      <w:r>
+        <w:rPr>
+          <w:rStyle w:val="CodeChar"/>
+        </w:rPr>
+        <w:t xml:space="preserve">benchmark/cluster_ci.py</w:t>
+      </w:r>
+      <w:r>
+        <w:t xml:space="preserve">; all comparisons in </w:t>
+      </w:r>
+      <w:r>
+        <w:rPr>
+          <w:rStyle w:val="CodeChar"/>
+        </w:rPr>
+        <w:t xml:space="preserve">benchmark/CLUSTER_CI.md</w:t>
+      </w:r>
+      <w:r>
+        <w:t xml:space="preserve">.</w:t>
+      </w:r>
+    </w:p>
+    <w:tbl>
+      <w:tblPr>
+        <w:tblStyle w:val="TableGrid"/>
+        <w:tblW w:w="0" w:type="auto"/>
+        <w:tblLayout w:type="fixed"/>
+        <w:tblLook w:val="04A0" w:firstRow="1" w:lastRow="0" w:firstColumn="0" w:lastColumn="0" w:noHBand="0" w:noVBand="1"/>
+      </w:tblPr>
+      <w:tblGrid>
+        <w:gridCol w:w="1337"/>
+        <w:gridCol w:w="1337"/>
+        <w:gridCol w:w="1337"/>
+        <w:gridCol w:w="1337"/>
+        <w:gridCol w:w="1337"/>
+        <w:gridCol w:w="1337"/>
+        <w:gridCol w:w="1337"/>
+      </w:tblGrid>
+      <w:tr>
+        <w:trPr>
+          <w:tblHeader/>
+        </w:trPr>
+        <w:tc>
+          <w:tcPr>
+            <w:tcW w:w="1337" w:type="dxa"/>
+            <w:shd w:val="clear" w:color="auto" w:fill="F2F2F2"/>
+          </w:tcPr>
+          <w:p>
+            <w:pPr/>
+            <w:r>
+              <w:t xml:space="preserve">Test</w:t>
+            </w:r>
+          </w:p>
+        </w:tc>
+        <w:tc>
+          <w:tcPr>
+            <w:tcW w:w="1337" w:type="dxa"/>
+            <w:shd w:val="clear" w:color="auto" w:fill="F2F2F2"/>
+          </w:tcPr>
+          <w:p>
+            <w:pPr/>
+            <w:r>
+              <w:t xml:space="preserve">Popularity</w:t>
+            </w:r>
+          </w:p>
+        </w:tc>
+        <w:tc>
+          <w:tcPr>
+            <w:tcW w:w="1337" w:type="dxa"/>
+            <w:shd w:val="clear" w:color="auto" w:fill="F2F2F2"/>
+          </w:tcPr>
+          <w:p>
+            <w:pPr/>
+            <w:r>
+              <w:t xml:space="preserve">TxGNN</w:t>
+            </w:r>
+          </w:p>
+        </w:tc>
+        <w:tc>
+          <w:tcPr>
+            <w:tcW w:w="1337" w:type="dxa"/>
+            <w:shd w:val="clear" w:color="auto" w:fill="F2F2F2"/>
+          </w:tcPr>
+          <w:p>
+            <w:pPr/>
+            <w:r>
+              <w:t xml:space="preserve">OREVID</w:t>
+            </w:r>
+          </w:p>
+        </w:tc>
+        <w:tc>
+          <w:tcPr>
+            <w:tcW w:w="1337" w:type="dxa"/>
+            <w:shd w:val="clear" w:color="auto" w:fill="F2F2F2"/>
+          </w:tcPr>
+          <w:p>
+            <w:pPr/>
+            <w:r>
+              <w:t xml:space="preserve">OREVID − TxGNN</w:t>
+            </w:r>
+          </w:p>
+        </w:tc>
+        <w:tc>
+          <w:tcPr>
+            <w:tcW w:w="1337" w:type="dxa"/>
+            <w:shd w:val="clear" w:color="auto" w:fill="F2F2F2"/>
+          </w:tcPr>
+          <w:p>
+            <w:pPr/>
+            <w:r>
+              <w:t xml:space="preserve">Ahead / behind</w:t>
+            </w:r>
+          </w:p>
+        </w:tc>
+        <w:tc>
+          <w:tcPr>
+            <w:tcW w:w="1337" w:type="dxa"/>
+            <w:shd w:val="clear" w:color="auto" w:fill="F2F2F2"/>
+          </w:tcPr>
+          <w:p>
+            <w:pPr/>
+            <w:r>
+              <w:t xml:space="preserve">Holm p</w:t>
+            </w:r>
+          </w:p>
+        </w:tc>
+      </w:tr>
+      <w:tr>
+        <w:tc>
+          <w:tcPr>
+            <w:tcW w:w="1337" w:type="dxa"/>
+          </w:tcPr>
+          <w:p>
+            <w:pPr/>
+            <w:r>
+              <w:t xml:space="preserve">Zero-shot</w:t>
+            </w:r>
+          </w:p>
+        </w:tc>
+        <w:tc>
+          <w:tcPr>
+            <w:tcW w:w="1337" w:type="dxa"/>
+          </w:tcPr>
+          <w:p>
+            <w:pPr/>
+            <w:r>
+              <w:t xml:space="preserve">0.358 (0.314–0.402)</w:t>
+            </w:r>
+          </w:p>
+        </w:tc>
+        <w:tc>
+          <w:tcPr>
+            <w:tcW w:w="1337" w:type="dxa"/>
+          </w:tcPr>
+          <w:p>
+            <w:pPr/>
+            <w:r>
+              <w:t xml:space="preserve">0.412 (0.369–0.457)</w:t>
+            </w:r>
+          </w:p>
+        </w:tc>
+        <w:tc>
+          <w:tcPr>
+            <w:tcW w:w="1337" w:type="dxa"/>
+          </w:tcPr>
+          <w:p>
+            <w:pPr/>
+            <w:r>
+              <w:t xml:space="preserve">0.811 (0.772–0.847)</w:t>
+            </w:r>
+          </w:p>
+        </w:tc>
+        <w:tc>
+          <w:tcPr>
+            <w:tcW w:w="1337" w:type="dxa"/>
+          </w:tcPr>
+          <w:p>
+            <w:pPr/>
+            <w:r>
+              <w:t xml:space="preserve">+0.399 (0.352–0.443)</w:t>
+            </w:r>
+          </w:p>
+        </w:tc>
+        <w:tc>
+          <w:tcPr>
+            <w:tcW w:w="1337" w:type="dxa"/>
+          </w:tcPr>
+          <w:p>
+            <w:pPr/>
+            <w:r>
+              <w:t xml:space="preserve">63% / 2%</w:t>
+            </w:r>
+          </w:p>
+        </w:tc>
+        <w:tc>
+          <w:tcPr>
+            <w:tcW w:w="1337" w:type="dxa"/>
+          </w:tcPr>
+          <w:p>
+            <w:pPr/>
+            <w:r>
+              <w:t xml:space="preserve">2 × 10⁻³³</w:t>
+            </w:r>
+          </w:p>
+        </w:tc>
+      </w:tr>
+      <w:tr>
+        <w:tc>
+          <w:tcPr>
+            <w:tcW w:w="1337" w:type="dxa"/>
+          </w:tcPr>
+          <w:p>
+            <w:pPr/>
+            <w:r>
+              <w:t xml:space="preserve">Zero-shot, hard</w:t>
+            </w:r>
+          </w:p>
+        </w:tc>
+        <w:tc>
+          <w:tcPr>
+            <w:tcW w:w="1337" w:type="dxa"/>
+          </w:tcPr>
+          <w:p>
+            <w:pPr/>
+            <w:r>
+              <w:t xml:space="preserve">0.203 (0.150–0.259)</w:t>
+            </w:r>
+          </w:p>
+        </w:tc>
+        <w:tc>
+          <w:tcPr>
+            <w:tcW w:w="1337" w:type="dxa"/>
+          </w:tcPr>
+          <w:p>
+            <w:pPr/>
+            <w:r>
+              <w:t xml:space="preserve">0.258 (0.197–0.324)</w:t>
+            </w:r>
+          </w:p>
+        </w:tc>
+        <w:tc>
+          <w:tcPr>
+            <w:tcW w:w="1337" w:type="dxa"/>
+          </w:tcPr>
+          <w:p>
+            <w:pPr/>
+            <w:r>
+              <w:t xml:space="preserve">0.539 (0.465–0.613)</w:t>
+            </w:r>
+          </w:p>
+        </w:tc>
+        <w:tc>
+          <w:tcPr>
+            <w:tcW w:w="1337" w:type="dxa"/>
+          </w:tcPr>
+          <w:p>
+            <w:pPr/>
+            <w:r>
+              <w:t xml:space="preserve">+0.281 (0.212–0.353)</w:t>
+            </w:r>
+          </w:p>
+        </w:tc>
+        <w:tc>
+          <w:tcPr>
+            <w:tcW w:w="1337" w:type="dxa"/>
+          </w:tcPr>
+          <w:p>
+            <w:pPr/>
+            <w:r>
+              <w:t xml:space="preserve">50% / 5%</w:t>
+            </w:r>
+          </w:p>
+        </w:tc>
+        <w:tc>
+          <w:tcPr>
+            <w:tcW w:w="1337" w:type="dxa"/>
+          </w:tcPr>
+          <w:p>
+            <w:pPr/>
+            <w:r>
+              <w:t xml:space="preserve">2 × 10⁻⁹</w:t>
+            </w:r>
+          </w:p>
+        </w:tc>
+      </w:tr>
+      <w:tr>
+        <w:tc>
+          <w:tcPr>
+            <w:tcW w:w="1337" w:type="dxa"/>
+          </w:tcPr>
+          <w:p>
+            <w:pPr/>
+            <w:r>
+              <w:t xml:space="preserve">Areas</w:t>
+            </w:r>
+          </w:p>
+        </w:tc>
+        <w:tc>
+          <w:tcPr>
+            <w:tcW w:w="1337" w:type="dxa"/>
+          </w:tcPr>
+          <w:p>
+            <w:pPr/>
+            <w:r>
+              <w:t xml:space="preserve">0.185 (0.132–0.239)</w:t>
+            </w:r>
+          </w:p>
+        </w:tc>
+        <w:tc>
+          <w:tcPr>
+            <w:tcW w:w="1337" w:type="dxa"/>
+          </w:tcPr>
+          <w:p>
+            <w:pPr/>
+            <w:r>
+              <w:t xml:space="preserve">0.237 (0.181–0.295)</w:t>
+            </w:r>
+          </w:p>
+        </w:tc>
+        <w:tc>
+          <w:tcPr>
+            <w:tcW w:w="1337" w:type="dxa"/>
+          </w:tcPr>
+          <w:p>
+            <w:pPr/>
+            <w:r>
+              <w:t xml:space="preserve">0.617 (0.566–0.665)</w:t>
+            </w:r>
+          </w:p>
+        </w:tc>
+        <w:tc>
+          <w:tcPr>
+            <w:tcW w:w="1337" w:type="dxa"/>
+          </w:tcPr>
+          <w:p>
+            <w:pPr/>
+            <w:r>
+              <w:t xml:space="preserve">+0.380 (0.314–0.447)</w:t>
+            </w:r>
+          </w:p>
+        </w:tc>
+        <w:tc>
+          <w:tcPr>
+            <w:tcW w:w="1337" w:type="dxa"/>
+          </w:tcPr>
+          <w:p>
+            <w:pPr/>
+            <w:r>
+              <w:t xml:space="preserve">63% / 3%</w:t>
+            </w:r>
+          </w:p>
+        </w:tc>
+        <w:tc>
+          <w:tcPr>
+            <w:tcW w:w="1337" w:type="dxa"/>
+          </w:tcPr>
+          <w:p>
+            <w:pPr/>
+            <w:r>
+              <w:t xml:space="preserve">2 × 10⁻³⁵</w:t>
+            </w:r>
+          </w:p>
+        </w:tc>
+      </w:tr>
+      <w:tr>
+        <w:tc>
+          <w:tcPr>
+            <w:tcW w:w="1337" w:type="dxa"/>
+          </w:tcPr>
+          <w:p>
+            <w:pPr/>
+            <w:r>
+              <w:t xml:space="preserve">Areas, hard</w:t>
+            </w:r>
+          </w:p>
+        </w:tc>
+        <w:tc>
+          <w:tcPr>
+            <w:tcW w:w="1337" w:type="dxa"/>
+          </w:tcPr>
+          <w:p>
+            <w:pPr/>
+            <w:r>
+              <w:t xml:space="preserve">0.141 (0.078–0.213)</w:t>
+            </w:r>
+          </w:p>
+        </w:tc>
+        <w:tc>
+          <w:tcPr>
+            <w:tcW w:w="1337" w:type="dxa"/>
+          </w:tcPr>
+          <w:p>
+            <w:pPr/>
+            <w:r>
+              <w:t xml:space="preserve">0.141 (0.086–0.204)</w:t>
+            </w:r>
+          </w:p>
+        </w:tc>
+        <w:tc>
+          <w:tcPr>
+            <w:tcW w:w="1337" w:type="dxa"/>
+          </w:tcPr>
+          <w:p>
+            <w:pPr/>
+            <w:r>
+              <w:t xml:space="preserve">0.490 (0.414–0.565)</w:t>
+            </w:r>
+          </w:p>
+        </w:tc>
+        <w:tc>
+          <w:tcPr>
+            <w:tcW w:w="1337" w:type="dxa"/>
+          </w:tcPr>
+          <w:p>
+            <w:pPr/>
+            <w:r>
+              <w:t xml:space="preserve">+0.349 (0.268–0.431)</w:t>
+            </w:r>
+          </w:p>
+        </w:tc>
+        <w:tc>
+          <w:tcPr>
+            <w:tcW w:w="1337" w:type="dxa"/>
+          </w:tcPr>
+          <w:p>
+            <w:pPr/>
+            <w:r>
+              <w:t xml:space="preserve">56% / 4%</w:t>
+            </w:r>
+          </w:p>
+        </w:tc>
+        <w:tc>
+          <w:tcPr>
+            <w:tcW w:w="1337" w:type="dxa"/>
+          </w:tcPr>
+          <w:p>
+            <w:pPr/>
+            <w:r>
+              <w:t xml:space="preserve">6 × 10⁻²¹</w:t>
+            </w:r>
+          </w:p>
+        </w:tc>
+      </w:tr>
+      <w:tr>
+        <w:tc>
+          <w:tcPr>
+            <w:tcW w:w="1337" w:type="dxa"/>
+          </w:tcPr>
+          <w:p>
+            <w:pPr/>
+            <w:r>
+              <w:t xml:space="preserve">External</w:t>
+            </w:r>
+          </w:p>
+        </w:tc>
+        <w:tc>
+          <w:tcPr>
+            <w:tcW w:w="1337" w:type="dxa"/>
+          </w:tcPr>
+          <w:p>
+            <w:pPr/>
+            <w:r>
+              <w:t xml:space="preserve">0.130 (0.109–0.152)</w:t>
+            </w:r>
+          </w:p>
+        </w:tc>
+        <w:tc>
+          <w:tcPr>
+            <w:tcW w:w="1337" w:type="dxa"/>
+          </w:tcPr>
+          <w:p>
+            <w:pPr/>
+            <w:r>
+              <w:t xml:space="preserve">0.121 (0.100–0.143)</w:t>
+            </w:r>
+          </w:p>
+        </w:tc>
+        <w:tc>
+          <w:tcPr>
+            <w:tcW w:w="1337" w:type="dxa"/>
+          </w:tcPr>
+          <w:p>
+            <w:pPr/>
+            <w:r>
+              <w:t xml:space="preserve">0.359 (0.327–0.390)</w:t>
+            </w:r>
+          </w:p>
+        </w:tc>
+        <w:tc>
+          <w:tcPr>
+            <w:tcW w:w="1337" w:type="dxa"/>
+          </w:tcPr>
+          <w:p>
+            <w:pPr/>
+            <w:r>
+              <w:t xml:space="preserve">+0.238 (0.206–0.270)</w:t>
+            </w:r>
+          </w:p>
+        </w:tc>
+        <w:tc>
+          <w:tcPr>
+            <w:tcW w:w="1337" w:type="dxa"/>
+          </w:tcPr>
+          <w:p>
+            <w:pPr/>
+            <w:r>
+              <w:t xml:space="preserve">43% / 5%</w:t>
+            </w:r>
+          </w:p>
+        </w:tc>
+        <w:tc>
+          <w:tcPr>
+            <w:tcW w:w="1337" w:type="dxa"/>
+          </w:tcPr>
+          <w:p>
+            <w:pPr/>
+            <w:r>
+              <w:t xml:space="preserve">1 × 10⁻³⁴</w:t>
+            </w:r>
+          </w:p>
+        </w:tc>
+      </w:tr>
+      <w:tr>
+        <w:tc>
+          <w:tcPr>
+            <w:tcW w:w="1337" w:type="dxa"/>
+          </w:tcPr>
+          <w:p>
+            <w:pPr/>
+            <w:r>
+              <w:t xml:space="preserve">External, non-obvious</w:t>
+            </w:r>
+          </w:p>
+        </w:tc>
+        <w:tc>
+          <w:tcPr>
+            <w:tcW w:w="1337" w:type="dxa"/>
+          </w:tcPr>
+          <w:p>
+            <w:pPr/>
+            <w:r>
+              <w:t xml:space="preserve">0.075 (0.058–0.094)</w:t>
+            </w:r>
+          </w:p>
+        </w:tc>
+        <w:tc>
+          <w:tcPr>
+            <w:tcW w:w="1337" w:type="dxa"/>
+          </w:tcPr>
+          <w:p>
+            <w:pPr/>
+            <w:r>
+              <w:t xml:space="preserve">0.085 (0.066–0.105)</w:t>
+            </w:r>
+          </w:p>
+        </w:tc>
+        <w:tc>
+          <w:tcPr>
+            <w:tcW w:w="1337" w:type="dxa"/>
+          </w:tcPr>
+          <w:p>
+            <w:pPr/>
+            <w:r>
+              <w:t xml:space="preserve">0.178 (0.152–0.206)</w:t>
+            </w:r>
+          </w:p>
+        </w:tc>
+        <w:tc>
+          <w:tcPr>
+            <w:tcW w:w="1337" w:type="dxa"/>
+          </w:tcPr>
+          <w:p>
+            <w:pPr/>
+            <w:r>
+              <w:t xml:space="preserve">+0.094 (0.064–0.123)</w:t>
+            </w:r>
+          </w:p>
+        </w:tc>
+        <w:tc>
+          <w:tcPr>
+            <w:tcW w:w="1337" w:type="dxa"/>
+          </w:tcPr>
+          <w:p>
+            <w:pPr/>
+            <w:r>
+              <w:t xml:space="preserve">24% / 9%</w:t>
+            </w:r>
+          </w:p>
+        </w:tc>
+        <w:tc>
+          <w:tcPr>
+            <w:tcW w:w="1337" w:type="dxa"/>
+          </w:tcPr>
+          <w:p>
+            <w:pPr/>
+            <w:r>
+              <w:t xml:space="preserve">2 × 10⁻⁹</w:t>
+            </w:r>
+          </w:p>
+        </w:tc>
+      </w:tr>
+      <w:tr>
+        <w:tc>
+          <w:tcPr>
+            <w:tcW w:w="1337" w:type="dxa"/>
+          </w:tcPr>
+          <w:p>
+            <w:pPr/>
+            <w:r>
+              <w:t xml:space="preserve">External, recent</w:t>
+            </w:r>
+          </w:p>
+        </w:tc>
+        <w:tc>
+          <w:tcPr>
+            <w:tcW w:w="1337" w:type="dxa"/>
+          </w:tcPr>
+          <w:p>
+            <w:pPr/>
+            <w:r>
+              <w:t xml:space="preserve">0.097 (0.045–0.154)</w:t>
+            </w:r>
+          </w:p>
+        </w:tc>
+        <w:tc>
+          <w:tcPr>
+            <w:tcW w:w="1337" w:type="dxa"/>
+          </w:tcPr>
+          <w:p>
+            <w:pPr/>
+            <w:r>
+              <w:t xml:space="preserve">0.119 (0.061–0.184)</w:t>
+            </w:r>
+          </w:p>
+        </w:tc>
+        <w:tc>
+          <w:tcPr>
+            <w:tcW w:w="1337" w:type="dxa"/>
+          </w:tcPr>
+          <w:p>
+            <w:pPr/>
+            <w:r>
+              <w:t xml:space="preserve">0.355 (0.266–0.448)</w:t>
+            </w:r>
+          </w:p>
+        </w:tc>
+        <w:tc>
+          <w:tcPr>
+            <w:tcW w:w="1337" w:type="dxa"/>
+          </w:tcPr>
+          <w:p>
+            <w:pPr/>
+            <w:r>
+              <w:t xml:space="preserve">+0.236 (0.141–0.332)</w:t>
+            </w:r>
+          </w:p>
+        </w:tc>
+        <w:tc>
+          <w:tcPr>
+            <w:tcW w:w="1337" w:type="dxa"/>
+          </w:tcPr>
+          <w:p>
+            <w:pPr/>
+            <w:r>
+              <w:t xml:space="preserve">30% / 4%</w:t>
+            </w:r>
+          </w:p>
+        </w:tc>
+        <w:tc>
+          <w:tcPr>
+            <w:tcW w:w="1337" w:type="dxa"/>
+          </w:tcPr>
+          <w:p>
+            <w:pPr/>
+            <w:r>
+              <w:t xml:space="preserve">2 × 10⁻⁴</w:t>
             </w:r>
           </w:p>
         </w:tc>

</xml_diff>

<commit_message>
P40: shared-genes hypergeometric test over the genes only (it counted diseases too), threshold re-matched to p < 1e-5
- protocol fixed before running (docs/HYPERGEOMETRIC_N.md, evaluation/hypergeom_n.py): threshold chosen by agreement
  with the validated selection (Jaccard 0.968), accepted on the external exam (4.3 % vs 4.2 %, candidates -4.4 %)
- same corrected test in web/build.py, app.js and the evaluation scripts; tests/test_thresholds.py keeps them equal
- website rebuilt in full; Method page and help texts updated in three languages
- evidence figures recomputed (docs/EVIDENCE.md, docs/EVIDENCE_CI.md): the permutation null still fails (P38)
- DECISIONS P40, REVIEW_RESPONSE, STATUS, README, PANEL and the preprint draft updated

Co-Authored-By: Claude Opus 5.5 <noreply@anthropic.com>
</commit_message>
<xml_diff>
--- a/docs/preprint/OREVID_preprint_draft.docx
+++ b/docs/preprint/OREVID_preprint_draft.docx
@@ -51,7 +51,7 @@
         <w:t xml:space="preserve">Methods.</w:t>
       </w:r>
       <w:r>
-        <w:t xml:space="preserve"> The graph combines PrimeKG, Open Targets, STRING and PubTator3 (157,822 nodes, 9.46 million edges). For each disease, 22 degree-weighted metapath features feed a LightGBM LambdaRank model trained with masked neighbourhoods. A candidate is shown only if it is indicated for an ontology-neighbour disease or for a disease sharing at least 3 associated genes (hypergeometric p &lt; 10⁻⁶). The acceptance criteria for these rules were set in advance; the rules were revised on the hidden-treatment benchmarks and then measured on an external set of approvals not used to choose them. TxGNN was retrained with its official code on the same PrimeKG splits, and all tasks and predictions are released as OREVID-bench.</w:t>
+        <w:t xml:space="preserve"> The graph combines PrimeKG, Open Targets, STRING and PubTator3 (157,822 nodes, 9.46 million edges). For each disease, 22 degree-weighted metapath features feed a LightGBM LambdaRank model trained with masked neighbourhoods. A candidate is shown only if it is indicated for an ontology-neighbour disease or for a disease sharing at least 3 associated genes (hypergeometric p &lt; 10⁻⁵ over the genes with at least one associated disease). The acceptance criteria for these rules were set in advance; the rules were revised on the hidden-treatment benchmarks and then measured on an external set of approvals not used to choose them. TxGNN was retrained with its official code on the same PrimeKG splits, and all tasks and predictions are released as OREVID-bench.</w:t>
       </w:r>
     </w:p>
     <w:p>
@@ -63,7 +63,7 @@
         <w:t xml:space="preserve">Results.</w:t>
       </w:r>
       <w:r>
-        <w:t xml:space="preserve"> Zero-shot Recall@100 (mean ± SD over five splits) was 0.811 ± 0.042 for OREVID, 0.412 ± 0.042 for TxGNN and 0.358 ± 0.040 for a popularity baseline, with OREVID ahead on every split (paired difference with TxGNN 0.399, 95% CI 0.352–0.443, resampling diseases). On nine disease areas held out it was 0.617 against 0.237, ahead in all nine, although TxGNN had the higher AUPRC in five. Training OREVID without validation labels and excluding diseases where TxGNN outputs constant scores gave 0.809 against 0.421. On 3,718 approvals absent from PrimeKG, Recall@100 was 0.359 against 0.121 (0.367 ± 0.008 against 0.126 ± 0.004 over five training splits), and 0.178 against 0.085 for the 2,719 approvals not obvious from the disease ontology; a logistic regression without the drug-popularity feature and a model without any Open Targets feature (0.348) performed similarly. Of the candidates the website's rules select in this external exam, 12.6% (95% CI 9.8–15.6%, resampling diseases) of direct extensions and 4.2% (3.1–5.5%) of shared-genes candidates were among the unseen approvals, against about 0.07% by chance; random gene sets of the same size selected candidates that were right as often, so the shared genes are not evidence of a shared mechanism. A drug acting on a disease gene, with no other evidence, was right 1.8–3.4% of the time, no better than candidates with no evidence line at all.</w:t>
+        <w:t xml:space="preserve"> Zero-shot Recall@100 (mean ± SD over five splits) was 0.811 ± 0.042 for OREVID, 0.412 ± 0.042 for TxGNN and 0.358 ± 0.040 for a popularity baseline, with OREVID ahead on every split (paired difference with TxGNN 0.399, 95% CI 0.352–0.443, resampling diseases). On nine disease areas held out it was 0.617 against 0.237, ahead in all nine, although TxGNN had the higher AUPRC in five. Training OREVID without validation labels and excluding diseases where TxGNN outputs constant scores gave 0.809 against 0.421. On 3,718 approvals absent from PrimeKG, Recall@100 was 0.359 against 0.121 (0.367 ± 0.008 against 0.126 ± 0.004 over five training splits), and 0.178 against 0.085 for the 2,719 approvals not obvious from the disease ontology; a logistic regression without the drug-popularity feature and a model without any Open Targets feature (0.348) performed similarly. Of the candidates the website's rules select in this external exam, 12.6% (95% CI 9.8–15.6%, resampling diseases) of direct extensions and 4.3% (3.1–5.6%) of shared-genes candidates were among the unseen approvals, against about 0.07% by chance; random gene sets of the same size selected candidates that were right as often, so the shared genes are not evidence of a shared mechanism. A drug acting on a disease gene, with no other evidence, was right 1.8–3.4% of the time, no better than candidates with no evidence line at all.</w:t>
       </w:r>
     </w:p>
     <w:p>
@@ -244,7 +244,7 @@
     <w:p>
       <w:pPr/>
       <w:r>
-        <w:t xml:space="preserve">Of the 25 highest-ranked candidates that are not already approved for the disease, a candidate is shown only if it is indicated for an ontology-neighbour disease («direct extension») or for a disease sharing at least 3 associated genes with a hypergeometric p &lt; 10⁻⁶ («shared genes»). Every other candidate is hidden. The acceptance criteria were fixed in advance: an evidence line had to separate correct from incorrect candidates on both the zero-shot benchmark (seeds 1–5) and the nine held-out disease areas, and a filter was applied only if the subset it removed had a hit rate below 5% in both. The rules themselves were revised in three rounds, each evaluated on both datasets, so the areas are not an untouched confirmation set. The external exam was used only as a confirmation set, together with the other splits, for two design decisions (the weight of the specificity correction and the removal of one data source, CTD), and never to choose an evidence rule. Neither decision moved the external result much: with CTD kept, as before the external set was consulted, OREVID's Recall@100 there was 0.352 instead of 0.359 (TxGNN 0.121), and the specificity correction is not applied to the benchmark rankings. A proposed grading of the shown candidates into three levels did not replicate (the first two levels swapped order on the hard area subset, and the third did not reach the threshold) and was dropped. Two filters suggested by an AI agent acting as reviewer (see Use of AI), requiring the drug's target to touch the shared genes and excluding anti-infectives in non-infectious diseases, failed the criterion and were not applied. Whether at least 3 of the shared genes are specific (associated with fewer than 100 diseases) is displayed but not used as a filter: as a filter it failed the same criterion (the subset it would remove was right 9–10% of the time).</w:t>
+        <w:t xml:space="preserve">Of the 25 highest-ranked candidates that are not already approved for the disease, a candidate is shown only if it is indicated for an ontology-neighbour disease («direct extension») or for a disease sharing at least 3 associated genes with a hypergeometric p &lt; 10⁻⁵, the population being the 19,735 genes with at least one associated disease («shared genes»). Every other candidate is hidden. An earlier version also counted the diseases in that population, which made p-values too small; when this was corrected, the threshold was re-matched from 10⁻⁶ to 10⁻⁵ to keep the validated selection (97% agreement on the benchmark and areas; on the external exam 4.3% against 4.2% of candidates correct, with 4% fewer candidates), and all figures here use the corrected test. The acceptance criteria were fixed in advance: an evidence line had to separate correct from incorrect candidates on both the zero-shot benchmark (seeds 1–5) and the nine held-out disease areas, and a filter was applied only if the subset it removed had a hit rate below 5% in both. The rules themselves were revised in three rounds, each evaluated on both datasets, so the areas are not an untouched confirmation set. The external exam was used only as a confirmation set, together with the other splits, for two design decisions (the weight of the specificity correction and the removal of one data source, CTD), and never to choose an evidence rule. Neither decision moved the external result much: with CTD kept, as before the external set was consulted, OREVID's Recall@100 there was 0.352 instead of 0.359 (TxGNN 0.121), and the specificity correction is not applied to the benchmark rankings. A proposed grading of the shown candidates into three levels did not replicate (the first two levels swapped order on the hard area subset, and the third did not reach the threshold) and was dropped. Two filters suggested by an AI agent acting as reviewer (see Use of AI), requiring the drug's target to touch the shared genes and excluding anti-infectives in non-infectious diseases, failed the criterion and were not applied. Whether at least 3 of the shared genes are specific (associated with fewer than 100 diseases) is displayed but not used as a filter: as a filter it failed the same criterion (the subset it would remove was right 9–11% of the time).</w:t>
       </w:r>
     </w:p>
     <w:p>
@@ -2191,7 +2191,7 @@
     <w:p>
       <w:pPr/>
       <w:r>
-        <w:t xml:space="preserve">Among each disease's 25 highest-ranked candidates, the evidence lines separated correct from incorrect candidates in the same direction on the benchmark, on the area splits and on the external exam (Figure 4; numbers in Supplementary Table S3). A drug acting on a disease-associated gene, with no other line, was correct 1.8–3.4% of the time, no better than candidates with no evidence line at all (1.5–2.5%); shared genes with a disease that has many associated genes, where the overlap did not reach p &lt; 10⁻⁶, were correct 0–2.5% of the time. When at least 3 shared genes were specific, shared-genes candidates were correct 30–32% of the time in hidden-treatment tests and 4.8% (95% CI 3.3–6.4%) in the external exam, against 9–10% and 2.7% (1.5–4.0%) otherwise.</w:t>
+        <w:t xml:space="preserve">Among each disease's 25 highest-ranked candidates, the evidence lines separated correct from incorrect candidates in the same direction on the benchmark, on the area splits and on the external exam (Figure 4; numbers in Supplementary Table S3). A drug acting on a disease-associated gene, with no other line, was correct 1.8–3.4% of the time, no better than candidates with no evidence line at all (1.4–2.4%); shared genes with a disease that has many associated genes, where the overlap did not reach the significance threshold, were correct 0–2.5% of the time. When at least 3 shared genes were specific, shared-genes candidates were correct 30–33% of the time in hidden-treatment tests and 4.8% (95% CI 3.3–6.5%) in the external exam, against 9–11% and 2.8% (1.6–4.2%) otherwise.</w:t>
       </w:r>
     </w:p>
     <w:p>
@@ -2257,7 +2257,7 @@
     <w:p>
       <w:pPr/>
       <w:r>
-        <w:t xml:space="preserve">The shared genes themselves, however, did not carry the signal. In the permutation test, random gene sets of the same size selected fewer candidates (2,613 on average, against 4,119) that were right 4.5% of the time on the external exam (99th percentile 4.8%), against 4.2% for the real shared genes, so the criterion fixed in advance was not met. In further, exploratory comparisons the same held within each range of gene-set size (fewer than 100 genes: 2.7% against a null of 2.2%; 100–499: 5.7% against 5.5%; 500 or more: 4.6% against 4.5%) and when at least 3 specific genes were required (4.8% against 5.1%); on the benchmark, only diseases with fewer than 100 genes were above the null (14.8% against a 99th percentile of 14.0%). The threshold itself was not a sharp optimum: from 2 to 5 genes and p from 10⁻⁴ to 10⁻⁸, the external hit rate ranged from 3.9% to 4.6% (Supplementary Table S5). The line therefore selects drugs already used in diseases of similar size and research intensity; the genes it lists are context, not evidence of a shared mechanism.</w:t>
+        <w:t xml:space="preserve">The shared genes themselves, however, did not carry the signal. In the permutation test, random gene sets of the same size selected fewer candidates (2,253 on average, against 3,936) that were right 4.9% of the time on the external exam (99th percentile 5.3%), against 4.3% for the real shared genes, so the criterion fixed in advance was not met. In further, exploratory comparisons the same held within each range of gene-set size (fewer than 100 genes: 2.7% against a null of 2.1%; 100–499: 5.9% against 5.9%; 500 or more: 4.6% against 4.6%), when at least 3 specific genes were required (4.8% against 5.3%), and on the benchmark in every range of gene-set size (for diseases with fewer than 100 genes, 15.0% against a null of 11.9% and a 99th percentile of 15.6%). The threshold itself was not a sharp optimum: from 2 to 5 genes and p from 10⁻³ to 10⁻⁷, the external hit rate ranged from 3.9% to 4.7% (Supplementary Table S5). The line therefore selects drugs already used in diseases of similar size and research intensity; the genes it lists are context, not evidence of a shared mechanism.</w:t>
       </w:r>
     </w:p>
     <w:p>
@@ -2277,13 +2277,13 @@
     <w:p>
       <w:pPr/>
       <w:r>
-        <w:t xml:space="preserve">Three non-obvious approvals from the external exam were ranked in the top 25 with shared-genes evidence and no indication in an ontology neighbour. Sirolimus ranked first for tuberous sclerosis, through renal cell carcinoma, with which it shares five genes including TSC1 and TSC2 (p = 1.7 × 10⁻⁷). Aripiprazole ranked sixth for Tourette syndrome, through autism spectrum disorder (75 shared genes). Pasireotide ranked 12th for acromegaly, through Cushing syndrome (AIP, GNAS and POMC; p = 4.6 × 10⁻⁹).</w:t>
+        <w:t xml:space="preserve">Three non-obvious approvals from the external exam were ranked in the top 25 with shared-genes evidence and no indication in an ontology neighbour. Sirolimus ranked first for tuberous sclerosis, through renal cell carcinoma, with which it shares five genes including TSC1 and TSC2 (p = 3.5 × 10⁻⁶). Aripiprazole ranked sixth for Tourette syndrome, through autism spectrum disorder (75 shared genes). Pasireotide ranked 12th for acromegaly, through Cushing syndrome (AIP, GNAS and POMC; p = 3.0 × 10⁻⁸).</w:t>
       </w:r>
     </w:p>
     <w:p>
       <w:pPr/>
       <w:r>
-        <w:t xml:space="preserve">The same evidence also fails in recognisable ways. Errors in gene–disease associations propagate: endocarditis carries genes associated with systemic lupus erythematosus in the source data, so antibiotics indicated for endocarditis (imipenem with cilastatin, cefapirin) are shown as candidates for lupus. Comorbidity reads as shared biology: rheumatoid arthritis shares immune genes with Graves disease, which brings the antithyroid drugs carbimazole and methimazole to the rheumatoid arthritis page. Broad-acting drugs recur despite the specificity correction: triamcinolone is shown on 1,228 of the 10,042 pages (12%), mostly rare syndromes whose genes overlap with those of diseases treated with corticosteroids. These cases are kept visible on the pages rather than filtered, and the website asks experts to flag them.</w:t>
+        <w:t xml:space="preserve">The same evidence also fails in recognisable ways. Errors in gene–disease associations propagate: endocarditis carries genes associated with systemic lupus erythematosus in the source data, so antibiotics indicated for endocarditis (imipenem with cilastatin, cefapirin) are shown as candidates for lupus. Comorbidity reads as shared biology: rheumatoid arthritis shares immune genes with Graves disease, which brings the antithyroid drugs carbimazole and methimazole to the rheumatoid arthritis page. Broad-acting drugs recur despite the specificity correction: triamcinolone is shown on 1,218 of the 10,042 pages (12%), mostly rare syndromes whose genes overlap with those of diseases treated with corticosteroids. These cases are kept visible on the pages rather than filtered, and the website asks experts to flag them.</w:t>
       </w:r>
     </w:p>
     <w:p>
@@ -2311,7 +2311,7 @@
     <w:p>
       <w:pPr/>
       <w:r>
-        <w:t xml:space="preserve">The website covers the 10,042 PrimeKG diseases with associated genes or phenotypes. A page shows, on average, 1.0 direct extension and 5.2 shared-genes candidates; 38% of diseases show neither (49% show no shared-genes candidate), mostly rare diseases with few associated genes, and the page says so instead of filling the list. Each candidate lists its evidence lines with the shared genes and p-values, the drug's targets and current indications, trials already run for the disease, and links for experts to send feedback, which will be used as new validation data. The exploratory list of drugs with no prior indication is shown separately and labelled as not validated. Pages link each disease to its broader term and its more specific forms, warn when the term is broad (at least 5 more specific forms or 500 associated genes), and mark direct extensions approved for a near-synonym of the disease.</w:t>
+        <w:t xml:space="preserve">The website covers the 10,042 PrimeKG diseases with associated genes or phenotypes. A page shows, on average, 1.0 direct extension and 5.1 shared-genes candidates; 39% of diseases show neither (49% show no shared-genes candidate), mostly rare diseases with few associated genes, and the page says so instead of filling the list. Each candidate lists its evidence lines with the shared genes and p-values, the drug's targets and current indications, trials already run for the disease, and links for experts to send feedback, which will be used as new validation data. The exploratory list of drugs with no prior indication is shown separately and labelled as not validated. Pages link each disease to its broader term and its more specific forms, warn when the term is broad (at least 5 more specific forms or 500 associated genes), and mark direct extensions approved for a near-synonym of the disease.</w:t>
       </w:r>
     </w:p>
     <w:p>
@@ -2349,7 +2349,7 @@
         <w:t xml:space="preserve">Limitations.</w:t>
       </w:r>
       <w:r>
-        <w:t xml:space="preserve"> All tests use recorded approvals as truth, which favours known treatments and penalises valid uses that were never approved. The external exam is out of sample but not prospective: most of those approvals predate PrimeKG and are simply missing from it. The disease areas were used while designing both the model and the evidence rules, so they are not an untouched test set, and the threshold that defines the hard subset (half of the drugs already in a neighbour) was set by hand. Open Targets supplies gene–disease features as well as the external labels, although removing every Open Targets feature changed the external Recall@100 by only 0.011. Errors in the sources propagate, including wrong gene–disease associations and comorbidities that read as shared biology. Subtypes defined by a biomarker are not represented by that marker in the graph; a curated rule removes drugs acting on an absent marker for the listed subtypes (tamoxifen no longer appears for triple-negative breast cancer), but markers outside that list, and subtypes defined by mutations the graph does not encode, can still inherit treatments that cannot work. Broad terms with many associated genes (breast cancer has 1,253) pass the shared-genes test with almost any cancer; their shared-genes candidates were still right more often than hidden ones on the external exam (4.6% against 1.4%), so they are kept, but they may apply only to one subtype, which the pages now say. The risk warning relies on recorded contraindications, gives no signal when the drug has no label in related diseases, and cannot detect opposite mechanisms or class toxicities; the direction of effect of a new drug is not predicted. Drugs with no prior indication remain beyond the reach of every model tested. Disease-area splits use one seed and approximate TxGNN's, which were drawn without a fixed seed. The reviews that led to some of the website's rules were done by AI agents, not by human experts (see Use of AI).</w:t>
+        <w:t xml:space="preserve"> All tests use recorded approvals as truth, which favours known treatments and penalises valid uses that were never approved. The external exam is out of sample but not prospective: most of those approvals predate PrimeKG and are simply missing from it. The disease areas were used while designing both the model and the evidence rules, so they are not an untouched test set, and the threshold that defines the hard subset (half of the drugs already in a neighbour) was set by hand. Open Targets supplies gene–disease features as well as the external labels, although removing every Open Targets feature changed the external Recall@100 by only 0.011. Errors in the sources propagate, including wrong gene–disease associations and comorbidities that read as shared biology. Subtypes defined by a biomarker are not represented by that marker in the graph; a curated rule removes drugs acting on an absent marker for the listed subtypes (tamoxifen no longer appears for triple-negative breast cancer), but markers outside that list, and subtypes defined by mutations the graph does not encode, can still inherit treatments that cannot work. Broad terms with many associated genes (breast cancer has 1,253) pass the shared-genes test with almost any cancer; their shared-genes candidates were still right more often than hidden ones on the external exam (4.6% against 1.5%), so they are kept, but they may apply only to one subtype, which the pages now say. The risk warning relies on recorded contraindications, gives no signal when the drug has no label in related diseases, and cannot detect opposite mechanisms or class toxicities; the direction of effect of a new drug is not predicted. Drugs with no prior indication remain beyond the reach of every model tested. Disease-area splits use one seed and approximate TxGNN's, which were drawn without a fixed seed. The reviews that led to some of the website's rules were done by AI agents, not by human experts (see Use of AI).</w:t>
       </w:r>
     </w:p>
     <w:p>
@@ -4363,7 +4363,7 @@
         <w:t xml:space="preserve">Supplementary Table S3.</w:t>
       </w:r>
       <w:r>
-        <w:t xml:space="preserve"> Percentage of candidates correct among the top 25 per disease, by the section the website's rules assign them to: hit rate (95% interval from a bootstrap that resamples whole diseases; number of candidates). In the external exam, shared-genes candidates with at least 3 specific genes: 4.8 (3.3–6.4; 3,007); with generic genes only: 2.7 (1.5–4.0; 1,112). The last row applies the website's exact specificity and exclusions to the external exam.</w:t>
+        <w:t xml:space="preserve"> Percentage of candidates correct among the top 25 per disease, by the section the website's rules assign them to: hit rate (95% interval from a bootstrap that resamples whole diseases; number of candidates). In the external exam, shared-genes candidates with at least 3 specific genes: 4.8 (3.3–6.5; 2,875); with generic genes only: 2.8 (1.6–4.2; 1,061). The last row applies the website's exact specificity and exclusions to the external exam.</w:t>
       </w:r>
     </w:p>
     <w:tbl>
@@ -4462,18 +4462,18 @@
           <w:p>
             <w:pPr/>
             <w:r>
-              <w:t xml:space="preserve">22.7 (17.2–28.4; 1,992)</w:t>
-            </w:r>
-          </w:p>
-        </w:tc>
-        <w:tc>
-          <w:tcPr>
-            <w:tcW w:w="2340" w:type="dxa"/>
-          </w:tcPr>
-          <w:p>
-            <w:pPr/>
-            <w:r>
-              <w:t xml:space="preserve">4.2 (2.9–5.9; 4,692)</w:t>
+              <w:t xml:space="preserve">23.0 (17.4–28.7; 1,970)</w:t>
+            </w:r>
+          </w:p>
+        </w:tc>
+        <w:tc>
+          <w:tcPr>
+            <w:tcW w:w="2340" w:type="dxa"/>
+          </w:tcPr>
+          <w:p>
+            <w:pPr/>
+            <w:r>
+              <w:t xml:space="preserve">4.2 (2.9–5.8; 4,714)</w:t>
             </w:r>
           </w:p>
         </w:tc>
@@ -4508,18 +4508,18 @@
           <w:p>
             <w:pPr/>
             <w:r>
-              <w:t xml:space="preserve">27.0 (18.3–36.3; 841)</w:t>
-            </w:r>
-          </w:p>
-        </w:tc>
-        <w:tc>
-          <w:tcPr>
-            <w:tcW w:w="2340" w:type="dxa"/>
-          </w:tcPr>
-          <w:p>
-            <w:pPr/>
-            <w:r>
-              <w:t xml:space="preserve">2.9 (1.8–4.1; 2,075)</w:t>
+              <w:t xml:space="preserve">27.4 (18.6–36.8; 828)</w:t>
+            </w:r>
+          </w:p>
+        </w:tc>
+        <w:tc>
+          <w:tcPr>
+            <w:tcW w:w="2340" w:type="dxa"/>
+          </w:tcPr>
+          <w:p>
+            <w:pPr/>
+            <w:r>
+              <w:t xml:space="preserve">2.9 (1.8–4.1; 2,088)</w:t>
             </w:r>
           </w:p>
         </w:tc>
@@ -4554,18 +4554,18 @@
           <w:p>
             <w:pPr/>
             <w:r>
-              <w:t xml:space="preserve">25.2 (20.8–29.8; 2,725)</w:t>
-            </w:r>
-          </w:p>
-        </w:tc>
-        <w:tc>
-          <w:tcPr>
-            <w:tcW w:w="2340" w:type="dxa"/>
-          </w:tcPr>
-          <w:p>
-            <w:pPr/>
-            <w:r>
-              <w:t xml:space="preserve">1.7 (1.1–2.4; 5,259)</w:t>
+              <w:t xml:space="preserve">26.3 (21.8–31.1; 2,608)</w:t>
+            </w:r>
+          </w:p>
+        </w:tc>
+        <w:tc>
+          <w:tcPr>
+            <w:tcW w:w="2340" w:type="dxa"/>
+          </w:tcPr>
+          <w:p>
+            <w:pPr/>
+            <w:r>
+              <w:t xml:space="preserve">1.7 (1.1–2.3; 5,376)</w:t>
             </w:r>
           </w:p>
         </w:tc>
@@ -4600,18 +4600,18 @@
           <w:p>
             <w:pPr/>
             <w:r>
-              <w:t xml:space="preserve">21.3 (16.7–26.2; 1,823)</w:t>
-            </w:r>
-          </w:p>
-        </w:tc>
-        <w:tc>
-          <w:tcPr>
-            <w:tcW w:w="2340" w:type="dxa"/>
-          </w:tcPr>
-          <w:p>
-            <w:pPr/>
-            <w:r>
-              <w:t xml:space="preserve">1.6 (0.9–2.4; 3,783)</w:t>
+              <w:t xml:space="preserve">22.5 (17.7–27.5; 1,726)</w:t>
+            </w:r>
+          </w:p>
+        </w:tc>
+        <w:tc>
+          <w:tcPr>
+            <w:tcW w:w="2340" w:type="dxa"/>
+          </w:tcPr>
+          <w:p>
+            <w:pPr/>
+            <w:r>
+              <w:t xml:space="preserve">1.6 (0.9–2.3; 3,880)</w:t>
             </w:r>
           </w:p>
         </w:tc>
@@ -4646,18 +4646,18 @@
           <w:p>
             <w:pPr/>
             <w:r>
-              <w:t xml:space="preserve">4.2 (3.1–5.5; 4,119)</w:t>
-            </w:r>
-          </w:p>
-        </w:tc>
-        <w:tc>
-          <w:tcPr>
-            <w:tcW w:w="2340" w:type="dxa"/>
-          </w:tcPr>
-          <w:p>
-            <w:pPr/>
-            <w:r>
-              <w:t xml:space="preserve">1.4 (1.1–1.8; 8,981)</w:t>
+              <w:t xml:space="preserve">4.3 (3.1–5.6; 3,936)</w:t>
+            </w:r>
+          </w:p>
+        </w:tc>
+        <w:tc>
+          <w:tcPr>
+            <w:tcW w:w="2340" w:type="dxa"/>
+          </w:tcPr>
+          <w:p>
+            <w:pPr/>
+            <w:r>
+              <w:t xml:space="preserve">1.5 (1.1–1.9; 9,164)</w:t>
             </w:r>
           </w:p>
         </w:tc>
@@ -4692,18 +4692,18 @@
           <w:p>
             <w:pPr/>
             <w:r>
-              <w:t xml:space="preserve">4.3 (3.1–5.6; 3,924)</w:t>
-            </w:r>
-          </w:p>
-        </w:tc>
-        <w:tc>
-          <w:tcPr>
-            <w:tcW w:w="2340" w:type="dxa"/>
-          </w:tcPr>
-          <w:p>
-            <w:pPr/>
-            <w:r>
-              <w:t xml:space="preserve">1.5 (1.1–1.9; 9,236)</w:t>
+              <w:t xml:space="preserve">4.3 (3.1–5.7; 3,749)</w:t>
+            </w:r>
+          </w:p>
+        </w:tc>
+        <w:tc>
+          <w:tcPr>
+            <w:tcW w:w="2340" w:type="dxa"/>
+          </w:tcPr>
+          <w:p>
+            <w:pPr/>
+            <w:r>
+              <w:t xml:space="preserve">1.5 (1.1–1.9; 9,411)</w:t>
             </w:r>
           </w:p>
         </w:tc>
@@ -5407,7 +5407,7 @@
         <w:t xml:space="preserve">Supplementary Table S5.</w:t>
       </w:r>
       <w:r>
-        <w:t xml:space="preserve"> Sensitivity of the shared-genes rule: hit rate of the shared-genes section (95% interval resampling diseases; number of candidates) for other thresholds on the number of shared genes and the hypergeometric p-value. Production: 3 genes, p &lt; 10⁻⁶. Permutation null on the external exam (100 random gene sets of the same size, genes drawn in proportion to their number of diseases): 4.5% on average, 99th percentile 4.8%.</w:t>
+        <w:t xml:space="preserve"> Sensitivity of the shared-genes rule: hit rate of the shared-genes section (95% interval resampling diseases; number of candidates) for other thresholds on the number of shared genes and the hypergeometric p-value (population: the 19,735 genes with at least one associated disease). Production: 3 genes, p &lt; 10⁻⁵. Permutation null on the external exam (100 random gene sets of the same size, genes drawn in proportion to their number of diseases): 4.9% on average, 99th percentile 5.3%.</w:t>
       </w:r>
     </w:p>
     <w:tbl>
@@ -5484,178 +5484,178 @@
           <w:p>
             <w:pPr/>
             <w:r>
-              <w:t xml:space="preserve">≥ 2, &lt; 10⁻⁴</w:t>
-            </w:r>
-          </w:p>
-        </w:tc>
-        <w:tc>
-          <w:tcPr>
-            <w:tcW w:w="2340" w:type="dxa"/>
-          </w:tcPr>
-          <w:p>
-            <w:pPr/>
-            <w:r>
-              <w:t xml:space="preserve">20.7 (15.8–25.8; 2,288)</w:t>
-            </w:r>
-          </w:p>
-        </w:tc>
-        <w:tc>
-          <w:tcPr>
-            <w:tcW w:w="2340" w:type="dxa"/>
-          </w:tcPr>
-          <w:p>
-            <w:pPr/>
-            <w:r>
-              <w:t xml:space="preserve">22.5 (18.6–26.6; 3,170)</w:t>
-            </w:r>
-          </w:p>
-        </w:tc>
-        <w:tc>
-          <w:tcPr>
-            <w:tcW w:w="2340" w:type="dxa"/>
-          </w:tcPr>
-          <w:p>
-            <w:pPr/>
-            <w:r>
-              <w:t xml:space="preserve">3.9 (2.9–5.0; 4,856)</w:t>
-            </w:r>
-          </w:p>
-        </w:tc>
-      </w:tr>
-      <w:tr>
-        <w:tc>
-          <w:tcPr>
-            <w:tcW w:w="2340" w:type="dxa"/>
-          </w:tcPr>
-          <w:p>
-            <w:pPr/>
-            <w:r>
-              <w:t xml:space="preserve">≥ 2, &lt; 10⁻⁶</w:t>
-            </w:r>
-          </w:p>
-        </w:tc>
-        <w:tc>
-          <w:tcPr>
-            <w:tcW w:w="2340" w:type="dxa"/>
-          </w:tcPr>
-          <w:p>
-            <w:pPr/>
-            <w:r>
-              <w:t xml:space="preserve">23.0 (17.7–28.7; 2,036)</w:t>
-            </w:r>
-          </w:p>
-        </w:tc>
-        <w:tc>
-          <w:tcPr>
-            <w:tcW w:w="2340" w:type="dxa"/>
-          </w:tcPr>
-          <w:p>
-            <w:pPr/>
-            <w:r>
-              <w:t xml:space="preserve">25.4 (21.1–29.9; 2,743)</w:t>
-            </w:r>
-          </w:p>
-        </w:tc>
-        <w:tc>
-          <w:tcPr>
-            <w:tcW w:w="2340" w:type="dxa"/>
-          </w:tcPr>
-          <w:p>
-            <w:pPr/>
-            <w:r>
-              <w:t xml:space="preserve">4.2 (3.1–5.5; 4,151)</w:t>
-            </w:r>
-          </w:p>
-        </w:tc>
-      </w:tr>
-      <w:tr>
-        <w:tc>
-          <w:tcPr>
-            <w:tcW w:w="2340" w:type="dxa"/>
-          </w:tcPr>
-          <w:p>
-            <w:pPr/>
-            <w:r>
-              <w:t xml:space="preserve">≥ 2, &lt; 10⁻⁸</w:t>
-            </w:r>
-          </w:p>
-        </w:tc>
-        <w:tc>
-          <w:tcPr>
-            <w:tcW w:w="2340" w:type="dxa"/>
-          </w:tcPr>
-          <w:p>
-            <w:pPr/>
-            <w:r>
-              <w:t xml:space="preserve">24.3 (18.4–30.4; 1,833)</w:t>
-            </w:r>
-          </w:p>
-        </w:tc>
-        <w:tc>
-          <w:tcPr>
-            <w:tcW w:w="2340" w:type="dxa"/>
-          </w:tcPr>
-          <w:p>
-            <w:pPr/>
-            <w:r>
-              <w:t xml:space="preserve">27.8 (23.2–32.8; 2,457)</w:t>
-            </w:r>
-          </w:p>
-        </w:tc>
-        <w:tc>
-          <w:tcPr>
-            <w:tcW w:w="2340" w:type="dxa"/>
-          </w:tcPr>
-          <w:p>
-            <w:pPr/>
-            <w:r>
-              <w:t xml:space="preserve">4.6 (3.3–6.0; 3,655)</w:t>
-            </w:r>
-          </w:p>
-        </w:tc>
-      </w:tr>
-      <w:tr>
-        <w:tc>
-          <w:tcPr>
-            <w:tcW w:w="2340" w:type="dxa"/>
-          </w:tcPr>
-          <w:p>
-            <w:pPr/>
-            <w:r>
-              <w:t xml:space="preserve">≥ 3, &lt; 10⁻⁴</w:t>
-            </w:r>
-          </w:p>
-        </w:tc>
-        <w:tc>
-          <w:tcPr>
-            <w:tcW w:w="2340" w:type="dxa"/>
-          </w:tcPr>
-          <w:p>
-            <w:pPr/>
-            <w:r>
-              <w:t xml:space="preserve">21.3 (16.2–26.8; 2,140)</w:t>
-            </w:r>
-          </w:p>
-        </w:tc>
-        <w:tc>
-          <w:tcPr>
-            <w:tcW w:w="2340" w:type="dxa"/>
-          </w:tcPr>
-          <w:p>
-            <w:pPr/>
-            <w:r>
-              <w:t xml:space="preserve">23.0 (19.0–27.0; 3,021)</w:t>
-            </w:r>
-          </w:p>
-        </w:tc>
-        <w:tc>
-          <w:tcPr>
-            <w:tcW w:w="2340" w:type="dxa"/>
-          </w:tcPr>
-          <w:p>
-            <w:pPr/>
-            <w:r>
-              <w:t xml:space="preserve">3.9 (2.9–5.0; 4,595)</w:t>
+              <w:t xml:space="preserve">≥ 2, &lt; 10⁻³</w:t>
+            </w:r>
+          </w:p>
+        </w:tc>
+        <w:tc>
+          <w:tcPr>
+            <w:tcW w:w="2340" w:type="dxa"/>
+          </w:tcPr>
+          <w:p>
+            <w:pPr/>
+            <w:r>
+              <w:t xml:space="preserve">20.6 (15.7–25.6; 2,306)</w:t>
+            </w:r>
+          </w:p>
+        </w:tc>
+        <w:tc>
+          <w:tcPr>
+            <w:tcW w:w="2340" w:type="dxa"/>
+          </w:tcPr>
+          <w:p>
+            <w:pPr/>
+            <w:r>
+              <w:t xml:space="preserve">22.5 (18.6–26.6; 3,168)</w:t>
+            </w:r>
+          </w:p>
+        </w:tc>
+        <w:tc>
+          <w:tcPr>
+            <w:tcW w:w="2340" w:type="dxa"/>
+          </w:tcPr>
+          <w:p>
+            <w:pPr/>
+            <w:r>
+              <w:t xml:space="preserve">3.9 (2.9–5.0; 4,898)</w:t>
+            </w:r>
+          </w:p>
+        </w:tc>
+      </w:tr>
+      <w:tr>
+        <w:tc>
+          <w:tcPr>
+            <w:tcW w:w="2340" w:type="dxa"/>
+          </w:tcPr>
+          <w:p>
+            <w:pPr/>
+            <w:r>
+              <w:t xml:space="preserve">≥ 2, &lt; 10⁻⁵</w:t>
+            </w:r>
+          </w:p>
+        </w:tc>
+        <w:tc>
+          <w:tcPr>
+            <w:tcW w:w="2340" w:type="dxa"/>
+          </w:tcPr>
+          <w:p>
+            <w:pPr/>
+            <w:r>
+              <w:t xml:space="preserve">23.0 (17.7–28.6; 2,036)</w:t>
+            </w:r>
+          </w:p>
+        </w:tc>
+        <w:tc>
+          <w:tcPr>
+            <w:tcW w:w="2340" w:type="dxa"/>
+          </w:tcPr>
+          <w:p>
+            <w:pPr/>
+            <w:r>
+              <w:t xml:space="preserve">26.5 (22.1–31.0; 2,646)</w:t>
+            </w:r>
+          </w:p>
+        </w:tc>
+        <w:tc>
+          <w:tcPr>
+            <w:tcW w:w="2340" w:type="dxa"/>
+          </w:tcPr>
+          <w:p>
+            <w:pPr/>
+            <w:r>
+              <w:t xml:space="preserve">4.3 (3.2–5.6; 3,996)</w:t>
+            </w:r>
+          </w:p>
+        </w:tc>
+      </w:tr>
+      <w:tr>
+        <w:tc>
+          <w:tcPr>
+            <w:tcW w:w="2340" w:type="dxa"/>
+          </w:tcPr>
+          <w:p>
+            <w:pPr/>
+            <w:r>
+              <w:t xml:space="preserve">≥ 2, &lt; 10⁻⁷</w:t>
+            </w:r>
+          </w:p>
+        </w:tc>
+        <w:tc>
+          <w:tcPr>
+            <w:tcW w:w="2340" w:type="dxa"/>
+          </w:tcPr>
+          <w:p>
+            <w:pPr/>
+            <w:r>
+              <w:t xml:space="preserve">25.7 (19.6–32.0; 1,774)</w:t>
+            </w:r>
+          </w:p>
+        </w:tc>
+        <w:tc>
+          <w:tcPr>
+            <w:tcW w:w="2340" w:type="dxa"/>
+          </w:tcPr>
+          <w:p>
+            <w:pPr/>
+            <w:r>
+              <w:t xml:space="preserve">29.5 (24.7–34.7; 2,315)</w:t>
+            </w:r>
+          </w:p>
+        </w:tc>
+        <w:tc>
+          <w:tcPr>
+            <w:tcW w:w="2340" w:type="dxa"/>
+          </w:tcPr>
+          <w:p>
+            <w:pPr/>
+            <w:r>
+              <w:t xml:space="preserve">4.7 (3.4–6.1; 3,411)</w:t>
+            </w:r>
+          </w:p>
+        </w:tc>
+      </w:tr>
+      <w:tr>
+        <w:tc>
+          <w:tcPr>
+            <w:tcW w:w="2340" w:type="dxa"/>
+          </w:tcPr>
+          <w:p>
+            <w:pPr/>
+            <w:r>
+              <w:t xml:space="preserve">≥ 3, &lt; 10⁻³</w:t>
+            </w:r>
+          </w:p>
+        </w:tc>
+        <w:tc>
+          <w:tcPr>
+            <w:tcW w:w="2340" w:type="dxa"/>
+          </w:tcPr>
+          <w:p>
+            <w:pPr/>
+            <w:r>
+              <w:t xml:space="preserve">21.3 (16.3–26.9; 2,132)</w:t>
+            </w:r>
+          </w:p>
+        </w:tc>
+        <w:tc>
+          <w:tcPr>
+            <w:tcW w:w="2340" w:type="dxa"/>
+          </w:tcPr>
+          <w:p>
+            <w:pPr/>
+            <w:r>
+              <w:t xml:space="preserve">23.3 (19.3–27.4; 2,979)</w:t>
+            </w:r>
+          </w:p>
+        </w:tc>
+        <w:tc>
+          <w:tcPr>
+            <w:tcW w:w="2340" w:type="dxa"/>
+          </w:tcPr>
+          <w:p>
+            <w:pPr/>
+            <w:r>
+              <w:t xml:space="preserve">3.9 (2.9–5.0; 4,549)</w:t>
             </w:r>
           </w:p>
         </w:tc>
@@ -5671,29 +5671,443 @@
               <w:rPr>
                 <w:b/>
               </w:rPr>
-              <w:t xml:space="preserve">≥ 3, &lt; 10⁻⁶ (production)</w:t>
-            </w:r>
-          </w:p>
-        </w:tc>
-        <w:tc>
-          <w:tcPr>
-            <w:tcW w:w="2340" w:type="dxa"/>
-          </w:tcPr>
-          <w:p>
-            <w:pPr/>
-            <w:r>
-              <w:t xml:space="preserve">22.7 (17.2–28.4; 1,992)</w:t>
-            </w:r>
-          </w:p>
-        </w:tc>
-        <w:tc>
-          <w:tcPr>
-            <w:tcW w:w="2340" w:type="dxa"/>
-          </w:tcPr>
-          <w:p>
-            <w:pPr/>
-            <w:r>
-              <w:t xml:space="preserve">25.2 (20.8–29.8; 2,725)</w:t>
+              <w:t xml:space="preserve">≥ 3, &lt; 10⁻⁵ (production)</w:t>
+            </w:r>
+          </w:p>
+        </w:tc>
+        <w:tc>
+          <w:tcPr>
+            <w:tcW w:w="2340" w:type="dxa"/>
+          </w:tcPr>
+          <w:p>
+            <w:pPr/>
+            <w:r>
+              <w:t xml:space="preserve">23.0 (17.4–28.7; 1,970)</w:t>
+            </w:r>
+          </w:p>
+        </w:tc>
+        <w:tc>
+          <w:tcPr>
+            <w:tcW w:w="2340" w:type="dxa"/>
+          </w:tcPr>
+          <w:p>
+            <w:pPr/>
+            <w:r>
+              <w:t xml:space="preserve">26.3 (21.8–31.1; 2,608)</w:t>
+            </w:r>
+          </w:p>
+        </w:tc>
+        <w:tc>
+          <w:tcPr>
+            <w:tcW w:w="2340" w:type="dxa"/>
+          </w:tcPr>
+          <w:p>
+            <w:pPr/>
+            <w:r>
+              <w:t xml:space="preserve">4.3 (3.1–5.6; 3,936)</w:t>
+            </w:r>
+          </w:p>
+        </w:tc>
+      </w:tr>
+      <w:tr>
+        <w:tc>
+          <w:tcPr>
+            <w:tcW w:w="2340" w:type="dxa"/>
+          </w:tcPr>
+          <w:p>
+            <w:pPr/>
+            <w:r>
+              <w:t xml:space="preserve">≥ 3, &lt; 10⁻⁷</w:t>
+            </w:r>
+          </w:p>
+        </w:tc>
+        <w:tc>
+          <w:tcPr>
+            <w:tcW w:w="2340" w:type="dxa"/>
+          </w:tcPr>
+          <w:p>
+            <w:pPr/>
+            <w:r>
+              <w:t xml:space="preserve">25.2 (19.1–31.5; 1,761)</w:t>
+            </w:r>
+          </w:p>
+        </w:tc>
+        <w:tc>
+          <w:tcPr>
+            <w:tcW w:w="2340" w:type="dxa"/>
+          </w:tcPr>
+          <w:p>
+            <w:pPr/>
+            <w:r>
+              <w:t xml:space="preserve">29.4 (24.5–34.5; 2,307)</w:t>
+            </w:r>
+          </w:p>
+        </w:tc>
+        <w:tc>
+          <w:tcPr>
+            <w:tcW w:w="2340" w:type="dxa"/>
+          </w:tcPr>
+          <w:p>
+            <w:pPr/>
+            <w:r>
+              <w:t xml:space="preserve">4.6 (3.3–6.1; 3,403)</w:t>
+            </w:r>
+          </w:p>
+        </w:tc>
+      </w:tr>
+      <w:tr>
+        <w:tc>
+          <w:tcPr>
+            <w:tcW w:w="2340" w:type="dxa"/>
+          </w:tcPr>
+          <w:p>
+            <w:pPr/>
+            <w:r>
+              <w:t xml:space="preserve">≥ 4, &lt; 10⁻³</w:t>
+            </w:r>
+          </w:p>
+        </w:tc>
+        <w:tc>
+          <w:tcPr>
+            <w:tcW w:w="2340" w:type="dxa"/>
+          </w:tcPr>
+          <w:p>
+            <w:pPr/>
+            <w:r>
+              <w:t xml:space="preserve">22.1 (16.5–27.9; 1,994)</w:t>
+            </w:r>
+          </w:p>
+        </w:tc>
+        <w:tc>
+          <w:tcPr>
+            <w:tcW w:w="2340" w:type="dxa"/>
+          </w:tcPr>
+          <w:p>
+            <w:pPr/>
+            <w:r>
+              <w:t xml:space="preserve">24.0 (19.7–28.6; 2,785)</w:t>
+            </w:r>
+          </w:p>
+        </w:tc>
+        <w:tc>
+          <w:tcPr>
+            <w:tcW w:w="2340" w:type="dxa"/>
+          </w:tcPr>
+          <w:p>
+            <w:pPr/>
+            <w:r>
+              <w:t xml:space="preserve">4.0 (2.9–5.2; 4,271)</w:t>
+            </w:r>
+          </w:p>
+        </w:tc>
+      </w:tr>
+      <w:tr>
+        <w:tc>
+          <w:tcPr>
+            <w:tcW w:w="2340" w:type="dxa"/>
+          </w:tcPr>
+          <w:p>
+            <w:pPr/>
+            <w:r>
+              <w:t xml:space="preserve">≥ 4, &lt; 10⁻⁵</w:t>
+            </w:r>
+          </w:p>
+        </w:tc>
+        <w:tc>
+          <w:tcPr>
+            <w:tcW w:w="2340" w:type="dxa"/>
+          </w:tcPr>
+          <w:p>
+            <w:pPr/>
+            <w:r>
+              <w:t xml:space="preserve">23.0 (17.4–29.0; 1,901)</w:t>
+            </w:r>
+          </w:p>
+        </w:tc>
+        <w:tc>
+          <w:tcPr>
+            <w:tcW w:w="2340" w:type="dxa"/>
+          </w:tcPr>
+          <w:p>
+            <w:pPr/>
+            <w:r>
+              <w:t xml:space="preserve">26.3 (21.7–31.0; 2,522)</w:t>
+            </w:r>
+          </w:p>
+        </w:tc>
+        <w:tc>
+          <w:tcPr>
+            <w:tcW w:w="2340" w:type="dxa"/>
+          </w:tcPr>
+          <w:p>
+            <w:pPr/>
+            <w:r>
+              <w:t xml:space="preserve">4.3 (3.1–5.6; 3,829)</w:t>
+            </w:r>
+          </w:p>
+        </w:tc>
+      </w:tr>
+      <w:tr>
+        <w:tc>
+          <w:tcPr>
+            <w:tcW w:w="2340" w:type="dxa"/>
+          </w:tcPr>
+          <w:p>
+            <w:pPr/>
+            <w:r>
+              <w:t xml:space="preserve">≥ 4, &lt; 10⁻⁷</w:t>
+            </w:r>
+          </w:p>
+        </w:tc>
+        <w:tc>
+          <w:tcPr>
+            <w:tcW w:w="2340" w:type="dxa"/>
+          </w:tcPr>
+          <w:p>
+            <w:pPr/>
+            <w:r>
+              <w:t xml:space="preserve">24.8 (18.8–31.2; 1,730)</w:t>
+            </w:r>
+          </w:p>
+        </w:tc>
+        <w:tc>
+          <w:tcPr>
+            <w:tcW w:w="2340" w:type="dxa"/>
+          </w:tcPr>
+          <w:p>
+            <w:pPr/>
+            <w:r>
+              <w:t xml:space="preserve">29.1 (24.1–34.3; 2,275)</w:t>
+            </w:r>
+          </w:p>
+        </w:tc>
+        <w:tc>
+          <w:tcPr>
+            <w:tcW w:w="2340" w:type="dxa"/>
+          </w:tcPr>
+          <w:p>
+            <w:pPr/>
+            <w:r>
+              <w:t xml:space="preserve">4.6 (3.2–6.1; 3,376)</w:t>
+            </w:r>
+          </w:p>
+        </w:tc>
+      </w:tr>
+      <w:tr>
+        <w:tc>
+          <w:tcPr>
+            <w:tcW w:w="2340" w:type="dxa"/>
+          </w:tcPr>
+          <w:p>
+            <w:pPr/>
+            <w:r>
+              <w:t xml:space="preserve">≥ 5, &lt; 10⁻³</w:t>
+            </w:r>
+          </w:p>
+        </w:tc>
+        <w:tc>
+          <w:tcPr>
+            <w:tcW w:w="2340" w:type="dxa"/>
+          </w:tcPr>
+          <w:p>
+            <w:pPr/>
+            <w:r>
+              <w:t xml:space="preserve">22.1 (16.3–28.1; 1,858)</w:t>
+            </w:r>
+          </w:p>
+        </w:tc>
+        <w:tc>
+          <w:tcPr>
+            <w:tcW w:w="2340" w:type="dxa"/>
+          </w:tcPr>
+          <w:p>
+            <w:pPr/>
+            <w:r>
+              <w:t xml:space="preserve">24.7 (20.3–29.5; 2,647)</w:t>
+            </w:r>
+          </w:p>
+        </w:tc>
+        <w:tc>
+          <w:tcPr>
+            <w:tcW w:w="2340" w:type="dxa"/>
+          </w:tcPr>
+          <w:p>
+            <w:pPr/>
+            <w:r>
+              <w:t xml:space="preserve">4.0 (2.8–5.2; 3,996)</w:t>
+            </w:r>
+          </w:p>
+        </w:tc>
+      </w:tr>
+      <w:tr>
+        <w:tc>
+          <w:tcPr>
+            <w:tcW w:w="2340" w:type="dxa"/>
+          </w:tcPr>
+          <w:p>
+            <w:pPr/>
+            <w:r>
+              <w:t xml:space="preserve">≥ 5, &lt; 10⁻⁵</w:t>
+            </w:r>
+          </w:p>
+        </w:tc>
+        <w:tc>
+          <w:tcPr>
+            <w:tcW w:w="2340" w:type="dxa"/>
+          </w:tcPr>
+          <w:p>
+            <w:pPr/>
+            <w:r>
+              <w:t xml:space="preserve">22.8 (16.8–28.7; 1,796)</w:t>
+            </w:r>
+          </w:p>
+        </w:tc>
+        <w:tc>
+          <w:tcPr>
+            <w:tcW w:w="2340" w:type="dxa"/>
+          </w:tcPr>
+          <w:p>
+            <w:pPr/>
+            <w:r>
+              <w:t xml:space="preserve">26.8 (22.1–31.8; 2,422)</w:t>
+            </w:r>
+          </w:p>
+        </w:tc>
+        <w:tc>
+          <w:tcPr>
+            <w:tcW w:w="2340" w:type="dxa"/>
+          </w:tcPr>
+          <w:p>
+            <w:pPr/>
+            <w:r>
+              <w:t xml:space="preserve">4.2 (3.0–5.6; 3,651)</w:t>
+            </w:r>
+          </w:p>
+        </w:tc>
+      </w:tr>
+      <w:tr>
+        <w:tc>
+          <w:tcPr>
+            <w:tcW w:w="2340" w:type="dxa"/>
+          </w:tcPr>
+          <w:p>
+            <w:pPr/>
+            <w:r>
+              <w:t xml:space="preserve">≥ 5, &lt; 10⁻⁷</w:t>
+            </w:r>
+          </w:p>
+        </w:tc>
+        <w:tc>
+          <w:tcPr>
+            <w:tcW w:w="2340" w:type="dxa"/>
+          </w:tcPr>
+          <w:p>
+            <w:pPr/>
+            <w:r>
+              <w:t xml:space="preserve">24.3 (18.1–30.7; 1,679)</w:t>
+            </w:r>
+          </w:p>
+        </w:tc>
+        <w:tc>
+          <w:tcPr>
+            <w:tcW w:w="2340" w:type="dxa"/>
+          </w:tcPr>
+          <w:p>
+            <w:pPr/>
+            <w:r>
+              <w:t xml:space="preserve">29.0 (23.9–34.2; 2,231)</w:t>
+            </w:r>
+          </w:p>
+        </w:tc>
+        <w:tc>
+          <w:tcPr>
+            <w:tcW w:w="2340" w:type="dxa"/>
+          </w:tcPr>
+          <w:p>
+            <w:pPr/>
+            <w:r>
+              <w:t xml:space="preserve">4.4 (3.1–5.9; 3,285)</w:t>
+            </w:r>
+          </w:p>
+        </w:tc>
+      </w:tr>
+      <w:tr>
+        <w:tc>
+          <w:tcPr>
+            <w:tcW w:w="2340" w:type="dxa"/>
+          </w:tcPr>
+          <w:p>
+            <w:pPr/>
+            <w:r>
+              <w:t xml:space="preserve">≥ 3, &lt; 10⁻⁵, ≥ 3 specific genes</w:t>
+            </w:r>
+          </w:p>
+        </w:tc>
+        <w:tc>
+          <w:tcPr>
+            <w:tcW w:w="2340" w:type="dxa"/>
+          </w:tcPr>
+          <w:p>
+            <w:pPr/>
+            <w:r>
+              <w:t xml:space="preserve">30.3 (22.7–37.9; 1,282)</w:t>
+            </w:r>
+          </w:p>
+        </w:tc>
+        <w:tc>
+          <w:tcPr>
+            <w:tcW w:w="2340" w:type="dxa"/>
+          </w:tcPr>
+          <w:p>
+            <w:pPr/>
+            <w:r>
+              <w:t xml:space="preserve">33.2 (27.5–39.0; 1,817)</w:t>
+            </w:r>
+          </w:p>
+        </w:tc>
+        <w:tc>
+          <w:tcPr>
+            <w:tcW w:w="2340" w:type="dxa"/>
+          </w:tcPr>
+          <w:p>
+            <w:pPr/>
+            <w:r>
+              <w:t xml:space="preserve">4.8 (3.4–6.5; 2,875)</w:t>
+            </w:r>
+          </w:p>
+        </w:tc>
+      </w:tr>
+      <w:tr>
+        <w:tc>
+          <w:tcPr>
+            <w:tcW w:w="2340" w:type="dxa"/>
+          </w:tcPr>
+          <w:p>
+            <w:pPr/>
+            <w:r>
+              <w:t xml:space="preserve">Before the correction: ≥ 3, &lt; 10⁻⁶, population counting diseases too</w:t>
+            </w:r>
+          </w:p>
+        </w:tc>
+        <w:tc>
+          <w:tcPr>
+            <w:tcW w:w="2340" w:type="dxa"/>
+          </w:tcPr>
+          <w:p>
+            <w:pPr/>
+            <w:r>
+              <w:t xml:space="preserve">22.7 (17.3–28.6; 1,992)</w:t>
+            </w:r>
+          </w:p>
+        </w:tc>
+        <w:tc>
+          <w:tcPr>
+            <w:tcW w:w="2340" w:type="dxa"/>
+          </w:tcPr>
+          <w:p>
+            <w:pPr/>
+            <w:r>
+              <w:t xml:space="preserve">25.2 (20.8–29.6; 2,725)</w:t>
             </w:r>
           </w:p>
         </w:tc>
@@ -5705,374 +6119,6 @@
             <w:pPr/>
             <w:r>
               <w:t xml:space="preserve">4.2 (3.1–5.5; 4,119)</w:t>
-            </w:r>
-          </w:p>
-        </w:tc>
-      </w:tr>
-      <w:tr>
-        <w:tc>
-          <w:tcPr>
-            <w:tcW w:w="2340" w:type="dxa"/>
-          </w:tcPr>
-          <w:p>
-            <w:pPr/>
-            <w:r>
-              <w:t xml:space="preserve">≥ 3, &lt; 10⁻⁸</w:t>
-            </w:r>
-          </w:p>
-        </w:tc>
-        <w:tc>
-          <w:tcPr>
-            <w:tcW w:w="2340" w:type="dxa"/>
-          </w:tcPr>
-          <w:p>
-            <w:pPr/>
-            <w:r>
-              <w:t xml:space="preserve">24.3 (18.3–30.4; 1,832)</w:t>
-            </w:r>
-          </w:p>
-        </w:tc>
-        <w:tc>
-          <w:tcPr>
-            <w:tcW w:w="2340" w:type="dxa"/>
-          </w:tcPr>
-          <w:p>
-            <w:pPr/>
-            <w:r>
-              <w:t xml:space="preserve">27.8 (23.1–32.6; 2,452)</w:t>
-            </w:r>
-          </w:p>
-        </w:tc>
-        <w:tc>
-          <w:tcPr>
-            <w:tcW w:w="2340" w:type="dxa"/>
-          </w:tcPr>
-          <w:p>
-            <w:pPr/>
-            <w:r>
-              <w:t xml:space="preserve">4.5 (3.3–5.9; 3,650)</w:t>
-            </w:r>
-          </w:p>
-        </w:tc>
-      </w:tr>
-      <w:tr>
-        <w:tc>
-          <w:tcPr>
-            <w:tcW w:w="2340" w:type="dxa"/>
-          </w:tcPr>
-          <w:p>
-            <w:pPr/>
-            <w:r>
-              <w:t xml:space="preserve">≥ 4, &lt; 10⁻⁴</w:t>
-            </w:r>
-          </w:p>
-        </w:tc>
-        <w:tc>
-          <w:tcPr>
-            <w:tcW w:w="2340" w:type="dxa"/>
-          </w:tcPr>
-          <w:p>
-            <w:pPr/>
-            <w:r>
-              <w:t xml:space="preserve">21.9 (16.4–27.7; 2,010)</w:t>
-            </w:r>
-          </w:p>
-        </w:tc>
-        <w:tc>
-          <w:tcPr>
-            <w:tcW w:w="2340" w:type="dxa"/>
-          </w:tcPr>
-          <w:p>
-            <w:pPr/>
-            <w:r>
-              <w:t xml:space="preserve">23.5 (19.3–28.0; 2,842)</w:t>
-            </w:r>
-          </w:p>
-        </w:tc>
-        <w:tc>
-          <w:tcPr>
-            <w:tcW w:w="2340" w:type="dxa"/>
-          </w:tcPr>
-          <w:p>
-            <w:pPr/>
-            <w:r>
-              <w:t xml:space="preserve">3.9 (2.9–5.1; 4,363)</w:t>
-            </w:r>
-          </w:p>
-        </w:tc>
-      </w:tr>
-      <w:tr>
-        <w:tc>
-          <w:tcPr>
-            <w:tcW w:w="2340" w:type="dxa"/>
-          </w:tcPr>
-          <w:p>
-            <w:pPr/>
-            <w:r>
-              <w:t xml:space="preserve">≥ 4, &lt; 10⁻⁶</w:t>
-            </w:r>
-          </w:p>
-        </w:tc>
-        <w:tc>
-          <w:tcPr>
-            <w:tcW w:w="2340" w:type="dxa"/>
-          </w:tcPr>
-          <w:p>
-            <w:pPr/>
-            <w:r>
-              <w:t xml:space="preserve">22.8 (17.2–28.6; 1,925)</w:t>
-            </w:r>
-          </w:p>
-        </w:tc>
-        <w:tc>
-          <w:tcPr>
-            <w:tcW w:w="2340" w:type="dxa"/>
-          </w:tcPr>
-          <w:p>
-            <w:pPr/>
-            <w:r>
-              <w:t xml:space="preserve">25.1 (20.5–29.6; 2,649)</w:t>
-            </w:r>
-          </w:p>
-        </w:tc>
-        <w:tc>
-          <w:tcPr>
-            <w:tcW w:w="2340" w:type="dxa"/>
-          </w:tcPr>
-          <w:p>
-            <w:pPr/>
-            <w:r>
-              <w:t xml:space="preserve">4.2 (3.1–5.5; 4,023)</w:t>
-            </w:r>
-          </w:p>
-        </w:tc>
-      </w:tr>
-      <w:tr>
-        <w:tc>
-          <w:tcPr>
-            <w:tcW w:w="2340" w:type="dxa"/>
-          </w:tcPr>
-          <w:p>
-            <w:pPr/>
-            <w:r>
-              <w:t xml:space="preserve">≥ 4, &lt; 10⁻⁸</w:t>
-            </w:r>
-          </w:p>
-        </w:tc>
-        <w:tc>
-          <w:tcPr>
-            <w:tcW w:w="2340" w:type="dxa"/>
-          </w:tcPr>
-          <w:p>
-            <w:pPr/>
-            <w:r>
-              <w:t xml:space="preserve">23.8 (18.0–30.0; 1,805)</w:t>
-            </w:r>
-          </w:p>
-        </w:tc>
-        <w:tc>
-          <w:tcPr>
-            <w:tcW w:w="2340" w:type="dxa"/>
-          </w:tcPr>
-          <w:p>
-            <w:pPr/>
-            <w:r>
-              <w:t xml:space="preserve">27.4 (22.6–32.4; 2,422)</w:t>
-            </w:r>
-          </w:p>
-        </w:tc>
-        <w:tc>
-          <w:tcPr>
-            <w:tcW w:w="2340" w:type="dxa"/>
-          </w:tcPr>
-          <w:p>
-            <w:pPr/>
-            <w:r>
-              <w:t xml:space="preserve">4.5 (3.2–5.9; 3,626)</w:t>
-            </w:r>
-          </w:p>
-        </w:tc>
-      </w:tr>
-      <w:tr>
-        <w:tc>
-          <w:tcPr>
-            <w:tcW w:w="2340" w:type="dxa"/>
-          </w:tcPr>
-          <w:p>
-            <w:pPr/>
-            <w:r>
-              <w:t xml:space="preserve">≥ 5, &lt; 10⁻⁴</w:t>
-            </w:r>
-          </w:p>
-        </w:tc>
-        <w:tc>
-          <w:tcPr>
-            <w:tcW w:w="2340" w:type="dxa"/>
-          </w:tcPr>
-          <w:p>
-            <w:pPr/>
-            <w:r>
-              <w:t xml:space="preserve">21.9 (16.1–27.8; 1,875)</w:t>
-            </w:r>
-          </w:p>
-        </w:tc>
-        <w:tc>
-          <w:tcPr>
-            <w:tcW w:w="2340" w:type="dxa"/>
-          </w:tcPr>
-          <w:p>
-            <w:pPr/>
-            <w:r>
-              <w:t xml:space="preserve">24.2 (19.8–28.9; 2,704)</w:t>
-            </w:r>
-          </w:p>
-        </w:tc>
-        <w:tc>
-          <w:tcPr>
-            <w:tcW w:w="2340" w:type="dxa"/>
-          </w:tcPr>
-          <w:p>
-            <w:pPr/>
-            <w:r>
-              <w:t xml:space="preserve">3.9 (2.8–5.1; 4,086)</w:t>
-            </w:r>
-          </w:p>
-        </w:tc>
-      </w:tr>
-      <w:tr>
-        <w:tc>
-          <w:tcPr>
-            <w:tcW w:w="2340" w:type="dxa"/>
-          </w:tcPr>
-          <w:p>
-            <w:pPr/>
-            <w:r>
-              <w:t xml:space="preserve">≥ 5, &lt; 10⁻⁶</w:t>
-            </w:r>
-          </w:p>
-        </w:tc>
-        <w:tc>
-          <w:tcPr>
-            <w:tcW w:w="2340" w:type="dxa"/>
-          </w:tcPr>
-          <w:p>
-            <w:pPr/>
-            <w:r>
-              <w:t xml:space="preserve">22.5 (16.6–28.4; 1,819)</w:t>
-            </w:r>
-          </w:p>
-        </w:tc>
-        <w:tc>
-          <w:tcPr>
-            <w:tcW w:w="2340" w:type="dxa"/>
-          </w:tcPr>
-          <w:p>
-            <w:pPr/>
-            <w:r>
-              <w:t xml:space="preserve">25.4 (20.9–30.3; 2,555)</w:t>
-            </w:r>
-          </w:p>
-        </w:tc>
-        <w:tc>
-          <w:tcPr>
-            <w:tcW w:w="2340" w:type="dxa"/>
-          </w:tcPr>
-          <w:p>
-            <w:pPr/>
-            <w:r>
-              <w:t xml:space="preserve">4.1 (2.9–5.4; 3,843)</w:t>
-            </w:r>
-          </w:p>
-        </w:tc>
-      </w:tr>
-      <w:tr>
-        <w:tc>
-          <w:tcPr>
-            <w:tcW w:w="2340" w:type="dxa"/>
-          </w:tcPr>
-          <w:p>
-            <w:pPr/>
-            <w:r>
-              <w:t xml:space="preserve">≥ 5, &lt; 10⁻⁸</w:t>
-            </w:r>
-          </w:p>
-        </w:tc>
-        <w:tc>
-          <w:tcPr>
-            <w:tcW w:w="2340" w:type="dxa"/>
-          </w:tcPr>
-          <w:p>
-            <w:pPr/>
-            <w:r>
-              <w:t xml:space="preserve">23.4 (17.4–29.7; 1,748)</w:t>
-            </w:r>
-          </w:p>
-        </w:tc>
-        <w:tc>
-          <w:tcPr>
-            <w:tcW w:w="2340" w:type="dxa"/>
-          </w:tcPr>
-          <w:p>
-            <w:pPr/>
-            <w:r>
-              <w:t xml:space="preserve">27.4 (22.4–32.3; 2,376)</w:t>
-            </w:r>
-          </w:p>
-        </w:tc>
-        <w:tc>
-          <w:tcPr>
-            <w:tcW w:w="2340" w:type="dxa"/>
-          </w:tcPr>
-          <w:p>
-            <w:pPr/>
-            <w:r>
-              <w:t xml:space="preserve">4.3 (3.1–5.7; 3,528)</w:t>
-            </w:r>
-          </w:p>
-        </w:tc>
-      </w:tr>
-      <w:tr>
-        <w:tc>
-          <w:tcPr>
-            <w:tcW w:w="2340" w:type="dxa"/>
-          </w:tcPr>
-          <w:p>
-            <w:pPr/>
-            <w:r>
-              <w:t xml:space="preserve">≥ 3, &lt; 10⁻⁶, ≥ 3 specific genes</w:t>
-            </w:r>
-          </w:p>
-        </w:tc>
-        <w:tc>
-          <w:tcPr>
-            <w:tcW w:w="2340" w:type="dxa"/>
-          </w:tcPr>
-          <w:p>
-            <w:pPr/>
-            <w:r>
-              <w:t xml:space="preserve">30.1 (22.5–37.6; 1,293)</w:t>
-            </w:r>
-          </w:p>
-        </w:tc>
-        <w:tc>
-          <w:tcPr>
-            <w:tcW w:w="2340" w:type="dxa"/>
-          </w:tcPr>
-          <w:p>
-            <w:pPr/>
-            <w:r>
-              <w:t xml:space="preserve">32.0 (26.4–37.6; 1,890)</w:t>
-            </w:r>
-          </w:p>
-        </w:tc>
-        <w:tc>
-          <w:tcPr>
-            <w:tcW w:w="2340" w:type="dxa"/>
-          </w:tcPr>
-          <w:p>
-            <w:pPr/>
-            <w:r>
-              <w:t xml:space="preserve">4.8 (3.4–6.3; 3,007)</w:t>
             </w:r>
           </w:p>
         </w:tc>

</xml_diff>

<commit_message>
Author name Joaquim Quadrada Jané everywhere, ORCID; account tasks done
- preprint (Claude Doc and exports), CITATION.cff (with ORCID), website legal notice and About page
  in three languages; app.js?v=33
- STATUS: preprint read by the author, ORCID, Gmail «send as» and Pages TXT done; next is bioRxiv

Co-Authored-By: Claude Opus 5.5 <noreply@anthropic.com>
</commit_message>
<xml_diff>
--- a/docs/preprint/OREVID_preprint_draft.docx
+++ b/docs/preprint/OREVID_preprint_draft.docx
@@ -16,10 +16,21 @@
         <w:rPr>
           <w:b/>
         </w:rPr>
-        <w:t xml:space="preserve">Joaquim Quadrada</w:t>
-      </w:r>
-      <w:r>
-        <w:t xml:space="preserve">, independent researcher, Barcelona, Spain. Correspondence: contact@orevid.org</w:t>
+        <w:t xml:space="preserve">Joaquim Quadrada Jané</w:t>
+      </w:r>
+      <w:r>
+        <w:t xml:space="preserve"> (ORCID </w:t>
+      </w:r>
+      <w:hyperlink r:id="rId3" w:history="1">
+        <w:r>
+          <w:rPr>
+            <w:rStyle w:val="Hyperlink"/>
+          </w:rPr>
+          <w:t xml:space="preserve">0009-0000-9624-332X</w:t>
+        </w:r>
+      </w:hyperlink>
+      <w:r>
+        <w:t xml:space="preserve">), independent researcher, Barcelona, Spain. Correspondence: contact@orevid.org</w:t>
       </w:r>
     </w:p>
     <w:p>
@@ -133,7 +144,7 @@
                     <pic:cNvPicPr/>
                   </pic:nvPicPr>
                   <pic:blipFill>
-                    <a:blip r:embed="rId3"/>
+                    <a:blip r:embed="rId4"/>
                     <a:stretch>
                       <a:fillRect/>
                     </a:stretch>
@@ -348,7 +359,7 @@
                     <pic:cNvPicPr/>
                   </pic:nvPicPr>
                   <pic:blipFill>
-                    <a:blip r:embed="rId4"/>
+                    <a:blip r:embed="rId5"/>
                     <a:stretch>
                       <a:fillRect/>
                     </a:stretch>
@@ -2127,7 +2138,7 @@
                     <pic:cNvPicPr/>
                   </pic:nvPicPr>
                   <pic:blipFill>
-                    <a:blip r:embed="rId5"/>
+                    <a:blip r:embed="rId6"/>
                     <a:stretch>
                       <a:fillRect/>
                     </a:stretch>
@@ -2209,7 +2220,7 @@
                     <pic:cNvPicPr/>
                   </pic:nvPicPr>
                   <pic:blipFill>
-                    <a:blip r:embed="rId6"/>
+                    <a:blip r:embed="rId7"/>
                     <a:stretch>
                       <a:fillRect/>
                     </a:stretch>

</xml_diff>

<commit_message>
bioRxiv declined the preprint (no institutional affiliation); adapted for Preprints.org
- preprint (Claude Doc and exports): keywords on the first page, AI use also in Methods, Conflicts of
  Interest just before the references (Preprints.org requirements)
- STATUS: bioRxiv rejection and account notes, Preprints.org plan and next steps

Co-Authored-By: Claude Opus 5.5 <noreply@anthropic.com>
</commit_message>
<xml_diff>
--- a/docs/preprint/OREVID_preprint_draft.docx
+++ b/docs/preprint/OREVID_preprint_draft.docx
@@ -31,6 +31,18 @@
       </w:hyperlink>
       <w:r>
         <w:t xml:space="preserve">), independent researcher, Barcelona, Spain. Correspondence: contact@orevid.org</w:t>
+      </w:r>
+    </w:p>
+    <w:p>
+      <w:pPr/>
+      <w:r>
+        <w:rPr>
+          <w:b/>
+        </w:rPr>
+        <w:t xml:space="preserve">Keywords:</w:t>
+      </w:r>
+      <w:r>
+        <w:t xml:space="preserve"> drug repurposing; knowledge graph; learning to rank; benchmark; evidence; TxGNN; PrimeKG</w:t>
       </w:r>
     </w:p>
     <w:p>
@@ -319,7 +331,7 @@
     <w:p>
       <w:pPr/>
       <w:r>
-        <w:t xml:space="preserve">OREVID uses Python 3.12.4, LightGBM 4.7.0, scikit-learn 1.9.1, NumPy 2.4.6, SciPy 1.18.0 and pandas 3.0.3. TxGNN ran in its own environment (Python 3.10, PyTorch 1.13.1 with CUDA 11.6, DGL 0.9.1). Training OREVID's predictor takes about 1 minute on a CPU and all OREVID evaluations about 35 minutes; TxGNN took about 95 minutes per split on one RTX 3060 GPU, about 22 hours for the 14 splits.</w:t>
+        <w:t xml:space="preserve">OREVID uses Python 3.12.4, LightGBM 4.7.0, scikit-learn 1.9.1, NumPy 2.4.6, SciPy 1.18.0 and pandas 3.0.3. TxGNN ran in its own environment (Python 3.10, PyTorch 1.13.1 with CUDA 11.6, DGL 0.9.1). Training OREVID's predictor takes about 1 minute on a CPU and all OREVID evaluations about 35 minutes; TxGNN took about 95 minutes per split on one RTX 3060 GPU, about 22 hours for the 14 splits. AI assistance (Claude, Anthropic) was used to write and review code, to support the data analysis and for language editing; the reviews by AI agents and how their suggestions were checked are described under Use of AI in the Declarations.</w:t>
       </w:r>
     </w:p>
     <w:p>
@@ -2407,18 +2419,6 @@
         <w:rPr>
           <w:b/>
         </w:rPr>
-        <w:t xml:space="preserve">Competing interests.</w:t>
-      </w:r>
-      <w:r>
-        <w:t xml:space="preserve"> None declared. The work was done in a personal capacity and is independent of the author's employer.</w:t>
-      </w:r>
-    </w:p>
-    <w:p>
-      <w:pPr/>
-      <w:r>
-        <w:rPr>
-          <w:b/>
-        </w:rPr>
         <w:t xml:space="preserve">Funding.</w:t>
       </w:r>
       <w:r>
@@ -2447,6 +2447,18 @@
       </w:r>
       <w:r>
         <w:t xml:space="preserve"> Journal articles were checked against PubMed, and conference papers and the technical report against their publishers' pages, on 12 October 2026.</w:t>
+      </w:r>
+    </w:p>
+    <w:p>
+      <w:pPr/>
+      <w:r>
+        <w:rPr>
+          <w:b/>
+        </w:rPr>
+        <w:t xml:space="preserve">Conflicts of Interest.</w:t>
+      </w:r>
+      <w:r>
+        <w:t xml:space="preserve"> The author declares no conflicts of interest. The work was done in a personal capacity and is independent of the author's employer.</w:t>
       </w:r>
     </w:p>
     <w:p>

</xml_diff>

<commit_message>
Improvement plan: I1 temporal validation (claim adopted), I2 calibration (not adopted), I3 practical information, I4 signature reversal (negative); biomarker table applied
- docs/TEMPORAL.md: graph and model as known in 2015; Recall@100 0.322 vs popularity 0.174 (paired +0.148, 0.123-0.173)
- docs/CALIBRATION.md: Brier gain 2.5 % < 5 %, the website keeps the section rates
- docs/PRACTICAL.md, sources/practical.py: generic / biosimilar status (FDA Orange Book, Purple Book, EMA), trials
  and articles per pair, «underexplored»; website columns, filters, CSV fields, EMA attribution
- docs/LINCS.md: LINCS L1000 reversal at chance for drugs with no prior use
- docs/BIOMARKERS.md: extended table applied; Gram-stain rule rejected
- I5 (embedding baselines) and I6 (shared-biology line) scripts committed before their first run
- DECISIONS P41-P45, STATUS, README, Method page and preprint updated

Co-Authored-By: Claude Opus 5.5 <noreply@anthropic.com>
</commit_message>
<xml_diff>
--- a/docs/preprint/OREVID_preprint_draft.docx
+++ b/docs/preprint/OREVID_preprint_draft.docx
@@ -86,7 +86,7 @@
         <w:t xml:space="preserve">Results.</w:t>
       </w:r>
       <w:r>
-        <w:t xml:space="preserve"> Zero-shot Recall@100 (mean ± SD over five splits) was 0.811 ± 0.042 for OREVID, 0.412 ± 0.042 for TxGNN and 0.358 ± 0.040 for a popularity baseline, with OREVID ahead on every split (paired difference with TxGNN 0.399, 95% CI 0.352–0.443, resampling diseases). On nine disease areas held out it was 0.617 against 0.237, ahead in all nine, although TxGNN had the higher AUPRC in five. Training OREVID without validation labels and excluding diseases where TxGNN outputs constant scores gave 0.809 against 0.421. On 3,718 approvals absent from PrimeKG, Recall@100 was 0.359 against 0.121 (0.367 ± 0.008 against 0.126 ± 0.004 over five training splits), and 0.178 against 0.085 for the 2,719 approvals not obvious from the disease ontology; a logistic regression without the drug-popularity feature and a model without any Open Targets feature (0.348) performed similarly. Of the candidates the website's rules select in this external exam, 12.6% (95% CI 9.8–15.6%, resampling diseases) of direct extensions and 4.3% (3.1–5.6%) of shared-genes candidates were among the unseen approvals, against about 0.07% by chance; random gene sets of the same size selected candidates that were right as often, so the shared genes are not evidence of a shared mechanism. A drug acting on a disease gene, with no other evidence, was right 1.8–3.4% of the time, no better than candidates with no evidence line at all.</w:t>
+        <w:t xml:space="preserve"> Zero-shot Recall@100 (mean ± SD over five splits) was 0.811 ± 0.042 for OREVID, 0.412 ± 0.042 for TxGNN and 0.358 ± 0.040 for a popularity baseline, with OREVID ahead on every split (paired difference with TxGNN 0.399, 95% CI 0.352–0.443, resampling diseases). On nine disease areas held out it was 0.617 against 0.237, ahead in all nine, although TxGNN had the higher AUPRC in five. Training OREVID without validation labels and excluding diseases where TxGNN outputs constant scores gave 0.809 against 0.421. On 3,718 approvals absent from PrimeKG, Recall@100 was 0.359 against 0.121 (0.367 ± 0.008 against 0.126 ± 0.004 over five training splits), and 0.178 against 0.085 for the 2,719 approvals not obvious from the disease ontology; a logistic regression without the drug-popularity feature and a model without any Open Targets feature (0.348) performed similarly. Of the candidates the website's rules select in this external exam, 12.6% (95% CI 9.8–15.6%, resampling diseases) of direct extensions and 4.3% (3.1–5.6%) of shared-genes candidates were among the unseen approvals, against about 0.07% by chance; random gene sets of the same size selected candidates that were right as often, so the shared genes are not evidence of a shared mechanism. A drug acting on a disease gene, with no other evidence, was right 1.8–3.4% of the time, no better than candidates with no evidence line at all. With the graph and the model rebuilt as known in 2015, the uses that later reached phase 3 or approval had a Recall@100 of 0.322 against 0.174 for popularity (paired difference 0.148, 95% CI 0.123–0.173), a pre-registered test.</w:t>
       </w:r>
     </w:p>
     <w:p>
@@ -315,6 +315,18 @@
       </w:r>
     </w:p>
     <w:p>
+      <w:pPr/>
+      <w:r>
+        <w:rPr>
+          <w:b/>
+        </w:rPr>
+        <w:t xml:space="preserve">Temporal validation.</w:t>
+      </w:r>
+      <w:r>
+        <w:t xml:space="preserve"> To test the prediction of later uses, the graph was rebuilt as it was known at a cutoff year: PrimeKG drug–disease edges whose first trial in Open Targets started at or after the cutoff, and Open Targets gene–disease associations first reported after it, were removed, and the model, the popularity baseline and the logistic regression were retrained on that graph. Positives were drug–disease pairs whose first trial started at or after the cutoff and that reached phase 3 or approval by Open Targets 26.06, excluding pairs already linked in the cutoff graph. The 2012 cutoff was used for development and 2015 for confirmation. The decision rule (claim an advantage only if the paired OREVID − popularity difference in Recall@100 at 2015 had a 95% interval excluding 0) and the secondary analyses were registered before running (docs/IMPROVEMENT_PLAN.md).</w:t>
+      </w:r>
+    </w:p>
+    <w:p>
       <w:pPr>
         <w:pStyle w:val="Heading3"/>
       </w:pPr>
@@ -2294,19 +2306,13 @@
         <w:pStyle w:val="Heading3"/>
       </w:pPr>
       <w:r>
-        <w:t xml:space="preserve">Examples</w:t>
+        <w:t xml:space="preserve">Temporal validation</w:t>
       </w:r>
     </w:p>
     <w:p>
       <w:pPr/>
       <w:r>
-        <w:t xml:space="preserve">Three non-obvious approvals from the external exam were ranked in the top 25 with shared-genes evidence and no indication in an ontology neighbour. Sirolimus ranked first for tuberous sclerosis, through renal cell carcinoma, with which it shares five genes including TSC1 and TSC2 (p = 3.5 × 10⁻⁶). Aripiprazole ranked sixth for Tourette syndrome, through autism spectrum disorder (75 shared genes). Pasireotide ranked 12th for acromegaly, through Cushing syndrome (AIP, GNAS and POMC; p = 3.0 × 10⁻⁸).</w:t>
-      </w:r>
-    </w:p>
-    <w:p>
-      <w:pPr/>
-      <w:r>
-        <w:t xml:space="preserve">The same evidence also fails in recognisable ways. Errors in gene–disease associations propagate: endocarditis carries genes associated with systemic lupus erythematosus in the source data, so antibiotics indicated for endocarditis (imipenem with cilastatin, cefapirin) are shown as candidates for lupus. Comorbidity reads as shared biology: rheumatoid arthritis shares immune genes with Graves disease, which brings the antithyroid drugs carbimazole and methimazole to the rheumatoid arthritis page. Broad-acting drugs recur despite the specificity correction: triamcinolone is shown on 1,218 of the 10,042 pages (12%), mostly rare syndromes whose genes overlap with those of diseases treated with corticosteroids. These cases are kept visible on the pages rather than filtered, and the website asks experts to flag them.</w:t>
+        <w:t xml:space="preserve">Rebuilt as known in 2015, OREVID ranked the uses that later reached phase 3 or approval well above popularity (813 test diseases, 2,832 pairs; Recall@100 0.322 against 0.174, paired difference 0.148, 95% CI 0.123–0.173), meeting the pre-registered rule; the development cutoff (2012) gave the same result (0.324 against 0.175). The difference held for pairs with no PrimeKG drug–disease edge of any kind (0.117, 0.093–0.142), for confirmed approvals (0.525 against 0.226) and for a model without any Open Targets feature (0.135), but it was small for non-obvious uses (0.043, 0.022–0.066). Among the 25 highest-ranked drugs per disease, 5.4% of direct extensions, 3.1% of shared-genes candidates and 0.8% of hidden drugs later reached phase 3 or approval, the same ordering as in the external exam. A logistic model that turned section, rank and gene-set size into a calibrated probability improved the Brier score over the section rates by only 2.5% (pre-registered threshold 5%) and is not used.</w:t>
       </w:r>
     </w:p>
     <w:p>
@@ -2314,13 +2320,19 @@
         <w:pStyle w:val="Heading3"/>
       </w:pPr>
       <w:r>
-        <w:t xml:space="preserve">Data errors found</w:t>
+        <w:t xml:space="preserve">Examples</w:t>
       </w:r>
     </w:p>
     <w:p>
       <w:pPr/>
       <w:r>
-        <w:t xml:space="preserve">Open Targets 26.06 lists 10,215 approved drug–disease pairs that map to the graph. Some label or agency report supports 5,805 of them, but only 5,390 are supported by a report that names a single drug and spells out the disease. Two recurring errors explain part of the rest: substances mentioned in another drug's label (lincomycin marked as approved for multiple sclerosis from the fingolimod label) and abbreviations (the Japanese regulator's «ad» for attention-deficit disorder read as Alzheimer disease). Agreement with PrimeKG's indications, which come from DrugBank, was 25.7% for pairs supported by a label or agency (n = 5,805), 14.4% for pairs supported only by the Therapeutic Target Database (n = 1,599) and 4.2% for pairs supported only by ATC classes (n = 2,482). Both errors were reported to Open Targets.</w:t>
+        <w:t xml:space="preserve">Three non-obvious approvals from the external exam were ranked in the top 25 with shared-genes evidence and no indication in an ontology neighbour. Sirolimus ranked first for tuberous sclerosis, through renal cell carcinoma, with which it shares five genes including TSC1 and TSC2 (p = 3.5 × 10⁻⁶). Aripiprazole ranked sixth for Tourette syndrome, through autism spectrum disorder (75 shared genes). Pasireotide ranked 12th for acromegaly, through Cushing syndrome (AIP, GNAS and POMC; p = 3.0 × 10⁻⁸).</w:t>
+      </w:r>
+    </w:p>
+    <w:p>
+      <w:pPr/>
+      <w:r>
+        <w:t xml:space="preserve">The same evidence also fails in recognisable ways. Errors in gene–disease associations propagate: endocarditis carries genes associated with systemic lupus erythematosus in the source data, so antibiotics indicated for endocarditis (imipenem with cilastatin, cefapirin) are shown as candidates for lupus. Comorbidity reads as shared biology: rheumatoid arthritis shares immune genes with Graves disease, which brings the antithyroid drugs carbimazole and methimazole to the rheumatoid arthritis page. Broad-acting drugs recur despite the specificity correction: triamcinolone is shown on 1,218 of the 10,042 pages (12%), mostly rare syndromes whose genes overlap with those of diseases treated with corticosteroids. These cases are kept visible on the pages rather than filtered, and the website asks experts to flag them.</w:t>
       </w:r>
     </w:p>
     <w:p>
@@ -2328,13 +2340,27 @@
         <w:pStyle w:val="Heading3"/>
       </w:pPr>
       <w:r>
+        <w:t xml:space="preserve">Data errors found</w:t>
+      </w:r>
+    </w:p>
+    <w:p>
+      <w:pPr/>
+      <w:r>
+        <w:t xml:space="preserve">Open Targets 26.06 lists 10,215 approved drug–disease pairs that map to the graph. Some label or agency report supports 5,805 of them, but only 5,390 are supported by a report that names a single drug and spells out the disease. Two recurring errors explain part of the rest: substances mentioned in another drug's label (lincomycin marked as approved for multiple sclerosis from the fingolimod label) and abbreviations (the Japanese regulator's «ad» for attention-deficit disorder read as Alzheimer disease). Agreement with PrimeKG's indications, which come from DrugBank, was 25.7% for pairs supported by a label or agency (n = 5,805), 14.4% for pairs supported only by the Therapeutic Target Database (n = 1,599) and 4.2% for pairs supported only by ATC classes (n = 2,482). Both errors were reported to Open Targets.</w:t>
+      </w:r>
+    </w:p>
+    <w:p>
+      <w:pPr>
+        <w:pStyle w:val="Heading3"/>
+      </w:pPr>
+      <w:r>
         <w:t xml:space="preserve">Website</w:t>
       </w:r>
     </w:p>
     <w:p>
       <w:pPr/>
       <w:r>
-        <w:t xml:space="preserve">The website covers the 10,042 PrimeKG diseases with associated genes or phenotypes. A page shows, on average, 1.0 direct extension and 5.1 shared-genes candidates; 39% of diseases show neither (49% show no shared-genes candidate), mostly rare diseases with few associated genes, and the page says so instead of filling the list. Each candidate lists its evidence lines with the shared genes and p-values, the drug's targets and current indications, trials already run for the disease, and links for experts to send feedback, which will be used as new validation data. The exploratory list of drugs with no prior indication is shown separately and labelled as not validated. Pages link each disease to its broader term and its more specific forms, warn when the term is broad (at least 5 more specific forms or 500 associated genes), and mark direct extensions approved for a near-synonym of the disease.</w:t>
+        <w:t xml:space="preserve">The website covers the 10,042 PrimeKG diseases with associated genes or phenotypes. A page shows, on average, 1.0 direct extension and 5.1 shared-genes candidates; 39% of diseases show neither (49% show no shared-genes candidate), mostly rare diseases with few associated genes, and the page says so instead of filling the list. Each candidate lists its evidence lines with the shared genes and p-values, the drug's targets and current indications, trials already run for the disease, and links for experts to send feedback, which will be used as new validation data. The exploratory list of drugs with no prior indication is shown separately and labelled as not validated. Pages link each disease to its broader term and its more specific forms, warn when the term is broad (at least 5 more specific forms or 500 associated genes), and mark direct extensions approved for a near-synonym of the disease. For information only, each candidate also shows whether a generic or biosimilar is marketed in the United States (FDA Orange Book and Purple Book) or authorised centrally in the European Union (EMA), and how many trials and articles already cover the pair; those with no trial and at most two articles are marked as underexplored.</w:t>
       </w:r>
     </w:p>
     <w:p>
@@ -2354,7 +2380,7 @@
     <w:p>
       <w:pPr/>
       <w:r>
-        <w:t xml:space="preserve">The practical value of a repurposing tool depends on precision for new indications, and here the numbers are modest. In the external exam about one in eight direct extensions and one in 25 shared-genes candidates was an approved indication; this is a lower bound, since many valid uses are never approved, but it means most candidates will not work. These approvals are missing from PrimeKG but mostly old (median first trial 2008) and may be recorded in other databases, so the exam measures the recovery of known indications absent from the training graph, not discovery; only the 158 recent approvals and the prospective test below come closer to new uses. Publishing these rates next to the optimistic hidden-treatment figures, and hiding candidates whose evidence does not beat chance, is meant to let users calibrate their trust.</w:t>
+        <w:t xml:space="preserve">The practical value of a repurposing tool depends on precision for new indications, and here the numbers are modest. In the external exam about one in eight direct extensions and one in 25 shared-genes candidates was an approved indication; this is a lower bound, since many valid uses are never approved, but it means most candidates will not work. These approvals are missing from PrimeKG but mostly old (median first trial 2008) and may be recorded in other databases, so the exam measures the recovery of known indications absent from the training graph, not discovery; only the 158 recent approvals, the temporal test and the prospective test below come closer to new uses. Publishing these rates next to the optimistic hidden-treatment figures, and hiding candidates whose evidence does not beat chance, is meant to let users calibrate their trust.</w:t>
       </w:r>
     </w:p>
     <w:p>
@@ -2372,7 +2398,7 @@
         <w:t xml:space="preserve">Limitations.</w:t>
       </w:r>
       <w:r>
-        <w:t xml:space="preserve"> All tests use recorded approvals as truth, which favours known treatments and penalises valid uses that were never approved. The external exam is out of sample but not prospective: most of those approvals predate PrimeKG and are simply missing from it. The disease areas were used while designing both the model and the evidence rules, so they are not an untouched test set, and the threshold that defines the hard subset (half of the drugs already in a neighbour) was set by hand. Open Targets supplies gene–disease features as well as the external labels, although removing every Open Targets feature changed the external Recall@100 by only 0.011. Errors in the sources propagate, including wrong gene–disease associations and comorbidities that read as shared biology. Subtypes defined by a biomarker are not represented by that marker in the graph; a curated rule removes drugs acting on an absent marker for the listed subtypes (tamoxifen no longer appears for triple-negative breast cancer), but markers outside that list, and subtypes defined by mutations the graph does not encode, can still inherit treatments that cannot work. Broad terms with many associated genes (breast cancer has 1,253) pass the shared-genes test with almost any cancer; their shared-genes candidates were still right more often than hidden ones on the external exam (4.6% against 1.5%), so they are kept, but they may apply only to one subtype, which the pages now say. The risk warning relies on recorded contraindications, gives no signal when the drug has no label in related diseases, and cannot detect opposite mechanisms or class toxicities; the direction of effect of a new drug is not predicted. Drugs with no prior indication remain beyond the reach of every model tested. Disease-area splits use one seed and approximate TxGNN's, which were drawn without a fixed seed. The reviews that led to some of the website's rules were done by AI agents, not by human experts (see Use of AI).</w:t>
+        <w:t xml:space="preserve"> All tests use recorded approvals as truth, which favours known treatments and penalises valid uses that were never approved. The external exam is out of sample but not prospective: most of those approvals predate PrimeKG and are simply missing from it. The temporal test removes later trials and associations from the graph, but 80% of PrimeKG indications carry no date and stay in the training graph, so some later knowledge may leak, and its advantage on non-obvious uses was small. The disease areas were used while designing both the model and the evidence rules, so they are not an untouched test set, and the threshold that defines the hard subset (half of the drugs already in a neighbour) was set by hand. Open Targets supplies gene–disease features as well as the external labels, although removing every Open Targets feature changed the external Recall@100 by only 0.011. Errors in the sources propagate, including wrong gene–disease associations and comorbidities that read as shared biology. Subtypes defined by a biomarker are not represented by that marker in the graph; a curated rule removes drugs acting on an absent marker for the listed subtypes (tamoxifen no longer appears for triple-negative breast cancer), but markers outside that list, and subtypes defined by mutations the graph does not encode, can still inherit treatments that cannot work. Broad terms with many associated genes (breast cancer has 1,253) pass the shared-genes test with almost any cancer; their shared-genes candidates were still right more often than hidden ones on the external exam (4.6% against 1.5%), so they are kept, but they may apply only to one subtype, which the pages now say. The risk warning relies on recorded contraindications, gives no signal when the drug has no label in related diseases, and cannot detect opposite mechanisms or class toxicities; the direction of effect of a new drug is not predicted. Drugs with no prior indication remain beyond the reach of every model tested. Disease-area splits use one seed and approximate TxGNN's, which were drawn without a fixed seed. The reviews that led to some of the website's rules were done by AI agents, not by human experts (see Use of AI).</w:t>
       </w:r>
     </w:p>
     <w:p>

</xml_diff>